<commit_message>
word con diagrama de architectura, pruebas en questa y capturas de pantalla
</commit_message>
<xml_diff>
--- a/DVVDS/T5.0/Task 5.docx
+++ b/DVVDS/T5.0/Task 5.docx
@@ -14,18 +14,16 @@
         <w:spacing w:line="240" w:lineRule="exact"/>
         <w:jc w:val="center"/>
         <w:rPr>
-          <w:rFonts w:ascii="Arial" w:hAnsi="Arial" w:cs="Arial"/>
-          <w:sz w:val="20"/>
-          <w:szCs w:val="20"/>
-          <w:lang w:val="en-US" w:eastAsia="en-US"/>
-        </w:rPr>
-      </w:pPr>
-      <w:r>
-        <w:rPr>
-          <w:rFonts w:ascii="Arial" w:hAnsi="Arial" w:cs="Arial"/>
-          <w:sz w:val="20"/>
-          <w:szCs w:val="20"/>
-          <w:lang w:val="en-US" w:eastAsia="en-US"/>
+          <w:sz w:val="20"/>
+          <w:szCs w:val="20"/>
+          <w:lang w:eastAsia="en-US"/>
+        </w:rPr>
+      </w:pPr>
+      <w:r>
+        <w:rPr>
+          <w:sz w:val="20"/>
+          <w:szCs w:val="20"/>
+          <w:lang w:eastAsia="en-US"/>
         </w:rPr>
         <w:t>José Sebastián González Ortega</w:t>
       </w:r>
@@ -42,120 +40,151 @@
         <w:spacing w:line="240" w:lineRule="exact"/>
         <w:jc w:val="center"/>
         <w:rPr>
-          <w:rFonts w:ascii="Arial" w:hAnsi="Arial" w:cs="Arial"/>
+          <w:sz w:val="20"/>
+          <w:szCs w:val="20"/>
+          <w:lang w:eastAsia="en-US"/>
+        </w:rPr>
+      </w:pPr>
+    </w:p>
+    <w:p>
+      <w:pPr>
+        <w:pStyle w:val="Title"/>
+        <w:rPr>
+          <w:rFonts w:ascii="Times New Roman" w:hAnsi="Times New Roman" w:cs="Times New Roman"/>
+          <w:lang w:eastAsia="en-US"/>
+        </w:rPr>
+      </w:pPr>
+      <w:r>
+        <w:rPr>
+          <w:rFonts w:ascii="Times New Roman" w:hAnsi="Times New Roman" w:cs="Times New Roman"/>
+          <w:lang w:eastAsia="en-US"/>
+        </w:rPr>
+        <w:t xml:space="preserve">Digital </w:t>
+      </w:r>
+      <w:proofErr w:type="spellStart"/>
+      <w:r>
+        <w:rPr>
+          <w:rFonts w:ascii="Times New Roman" w:hAnsi="Times New Roman" w:cs="Times New Roman"/>
+          <w:lang w:eastAsia="en-US"/>
+        </w:rPr>
+        <w:t>System</w:t>
+      </w:r>
+      <w:proofErr w:type="spellEnd"/>
+      <w:r>
+        <w:rPr>
+          <w:rFonts w:ascii="Times New Roman" w:hAnsi="Times New Roman" w:cs="Times New Roman"/>
+          <w:lang w:eastAsia="en-US"/>
+        </w:rPr>
+        <w:t xml:space="preserve"> </w:t>
+      </w:r>
+      <w:proofErr w:type="spellStart"/>
+      <w:r>
+        <w:rPr>
+          <w:rFonts w:ascii="Times New Roman" w:hAnsi="Times New Roman" w:cs="Times New Roman"/>
+          <w:lang w:eastAsia="en-US"/>
+        </w:rPr>
+        <w:t>Design</w:t>
+      </w:r>
+      <w:proofErr w:type="spellEnd"/>
+      <w:r>
+        <w:rPr>
+          <w:rFonts w:ascii="Times New Roman" w:hAnsi="Times New Roman" w:cs="Times New Roman"/>
+          <w:lang w:eastAsia="en-US"/>
+        </w:rPr>
+        <w:t xml:space="preserve"> and </w:t>
+      </w:r>
+      <w:proofErr w:type="spellStart"/>
+      <w:r>
+        <w:rPr>
+          <w:rFonts w:ascii="Times New Roman" w:hAnsi="Times New Roman" w:cs="Times New Roman"/>
+          <w:lang w:eastAsia="en-US"/>
+        </w:rPr>
+        <w:t>Verification</w:t>
+      </w:r>
+      <w:proofErr w:type="spellEnd"/>
+    </w:p>
+    <w:p>
+      <w:pPr>
+        <w:rPr>
           <w:sz w:val="20"/>
           <w:szCs w:val="20"/>
           <w:lang w:val="en-US" w:eastAsia="en-US"/>
         </w:rPr>
       </w:pPr>
-    </w:p>
-    <w:p>
-      <w:pPr>
-        <w:pStyle w:val="Title"/>
-        <w:rPr>
+      <w:r>
+        <w:rPr>
+          <w:sz w:val="20"/>
+          <w:szCs w:val="20"/>
           <w:lang w:val="en-US" w:eastAsia="en-US"/>
         </w:rPr>
-      </w:pPr>
-      <w:r>
-        <w:rPr>
+        <w:t xml:space="preserve">Design </w:t>
+      </w:r>
+      <w:r>
+        <w:rPr>
+          <w:sz w:val="20"/>
+          <w:szCs w:val="20"/>
           <w:lang w:val="en-US" w:eastAsia="en-US"/>
         </w:rPr>
-        <w:t>Digital System Design and Verification</w:t>
-      </w:r>
-    </w:p>
-    <w:p>
-      <w:pPr>
-        <w:rPr>
-          <w:rFonts w:ascii="Arial" w:hAnsi="Arial" w:cs="Arial"/>
+        <w:t>a</w:t>
+      </w:r>
+      <w:r>
+        <w:rPr>
           <w:sz w:val="20"/>
           <w:szCs w:val="20"/>
           <w:lang w:val="en-US" w:eastAsia="en-US"/>
         </w:rPr>
-      </w:pPr>
-      <w:r>
-        <w:rPr>
-          <w:rFonts w:ascii="Arial" w:hAnsi="Arial" w:cs="Arial"/>
+        <w:t xml:space="preserve"> </w:t>
+      </w:r>
+      <w:r>
+        <w:rPr>
           <w:sz w:val="20"/>
           <w:szCs w:val="20"/>
           <w:lang w:val="en-US" w:eastAsia="en-US"/>
         </w:rPr>
-        <w:t xml:space="preserve">Design </w:t>
-      </w:r>
-      <w:r>
-        <w:rPr>
-          <w:rFonts w:ascii="Arial" w:hAnsi="Arial" w:cs="Arial"/>
+        <w:t>UART module</w:t>
+      </w:r>
+      <w:r>
+        <w:rPr>
           <w:sz w:val="20"/>
           <w:szCs w:val="20"/>
           <w:lang w:val="en-US" w:eastAsia="en-US"/>
         </w:rPr>
-        <w:t>a</w:t>
-      </w:r>
-      <w:r>
-        <w:rPr>
-          <w:rFonts w:ascii="Arial" w:hAnsi="Arial" w:cs="Arial"/>
+        <w:t xml:space="preserve">: </w:t>
+      </w:r>
+      <w:r>
+        <w:rPr>
           <w:sz w:val="20"/>
           <w:szCs w:val="20"/>
           <w:lang w:val="en-US" w:eastAsia="en-US"/>
         </w:rPr>
-        <w:t xml:space="preserve"> </w:t>
-      </w:r>
-      <w:r>
-        <w:rPr>
-          <w:rFonts w:ascii="Arial" w:hAnsi="Arial" w:cs="Arial"/>
+        <w:t>either</w:t>
+      </w:r>
+      <w:r>
+        <w:rPr>
           <w:sz w:val="20"/>
           <w:szCs w:val="20"/>
           <w:lang w:val="en-US" w:eastAsia="en-US"/>
         </w:rPr>
-        <w:t>UART module</w:t>
-      </w:r>
-      <w:r>
-        <w:rPr>
-          <w:rFonts w:ascii="Arial" w:hAnsi="Arial" w:cs="Arial"/>
+        <w:t xml:space="preserve"> for transmission </w:t>
+      </w:r>
+      <w:r>
+        <w:rPr>
           <w:sz w:val="20"/>
           <w:szCs w:val="20"/>
           <w:lang w:val="en-US" w:eastAsia="en-US"/>
         </w:rPr>
-        <w:t xml:space="preserve">: </w:t>
-      </w:r>
-      <w:r>
-        <w:rPr>
-          <w:rFonts w:ascii="Arial" w:hAnsi="Arial" w:cs="Arial"/>
+        <w:t xml:space="preserve">or </w:t>
+      </w:r>
+      <w:r>
+        <w:rPr>
           <w:sz w:val="20"/>
           <w:szCs w:val="20"/>
           <w:lang w:val="en-US" w:eastAsia="en-US"/>
         </w:rPr>
-        <w:t>either</w:t>
-      </w:r>
-      <w:r>
-        <w:rPr>
-          <w:rFonts w:ascii="Arial" w:hAnsi="Arial" w:cs="Arial"/>
-          <w:sz w:val="20"/>
-          <w:szCs w:val="20"/>
-          <w:lang w:val="en-US" w:eastAsia="en-US"/>
-        </w:rPr>
-        <w:t xml:space="preserve"> for transmission </w:t>
-      </w:r>
-      <w:r>
-        <w:rPr>
-          <w:rFonts w:ascii="Arial" w:hAnsi="Arial" w:cs="Arial"/>
-          <w:sz w:val="20"/>
-          <w:szCs w:val="20"/>
-          <w:lang w:val="en-US" w:eastAsia="en-US"/>
-        </w:rPr>
-        <w:t xml:space="preserve">or </w:t>
-      </w:r>
-      <w:r>
-        <w:rPr>
-          <w:rFonts w:ascii="Arial" w:hAnsi="Arial" w:cs="Arial"/>
-          <w:sz w:val="20"/>
-          <w:szCs w:val="20"/>
-          <w:lang w:val="en-US" w:eastAsia="en-US"/>
-        </w:rPr>
         <w:t>for reception</w:t>
       </w:r>
       <w:r>
         <w:rPr>
-          <w:rFonts w:ascii="Arial" w:hAnsi="Arial" w:cs="Arial"/>
           <w:sz w:val="20"/>
           <w:szCs w:val="20"/>
           <w:lang w:val="en-US" w:eastAsia="en-US"/>
@@ -171,7 +200,7 @@
           <w:numId w:val="5"/>
         </w:numPr>
         <w:rPr>
-          <w:rFonts w:ascii="Arial" w:hAnsi="Arial" w:cs="Arial"/>
+          <w:rFonts w:ascii="Times New Roman" w:hAnsi="Times New Roman" w:cs="Times New Roman"/>
           <w:sz w:val="20"/>
           <w:szCs w:val="20"/>
           <w:lang w:val="en-US" w:eastAsia="en-US"/>
@@ -179,7 +208,7 @@
       </w:pPr>
       <w:r>
         <w:rPr>
-          <w:rFonts w:ascii="Arial" w:hAnsi="Arial" w:cs="Arial"/>
+          <w:rFonts w:ascii="Times New Roman" w:hAnsi="Times New Roman" w:cs="Times New Roman"/>
           <w:sz w:val="20"/>
           <w:szCs w:val="20"/>
           <w:lang w:val="en-US" w:eastAsia="en-US"/>
@@ -188,7 +217,7 @@
       </w:r>
       <w:r>
         <w:rPr>
-          <w:rFonts w:ascii="Arial" w:hAnsi="Arial" w:cs="Arial"/>
+          <w:rFonts w:ascii="Times New Roman" w:hAnsi="Times New Roman" w:cs="Times New Roman"/>
           <w:sz w:val="20"/>
           <w:szCs w:val="20"/>
           <w:lang w:val="en-US" w:eastAsia="en-US"/>
@@ -197,7 +226,7 @@
       </w:r>
       <w:r>
         <w:rPr>
-          <w:rFonts w:ascii="Arial" w:hAnsi="Arial" w:cs="Arial"/>
+          <w:rFonts w:ascii="Times New Roman" w:hAnsi="Times New Roman" w:cs="Times New Roman"/>
           <w:sz w:val="20"/>
           <w:szCs w:val="20"/>
           <w:lang w:val="en-US" w:eastAsia="en-US"/>
@@ -206,7 +235,7 @@
       </w:r>
       <w:r>
         <w:rPr>
-          <w:rFonts w:ascii="Arial" w:hAnsi="Arial" w:cs="Arial"/>
+          <w:rFonts w:ascii="Times New Roman" w:hAnsi="Times New Roman" w:cs="Times New Roman"/>
           <w:sz w:val="20"/>
           <w:szCs w:val="20"/>
           <w:lang w:val="en-US" w:eastAsia="en-US"/>
@@ -215,7 +244,7 @@
       </w:r>
       <w:r>
         <w:rPr>
-          <w:rFonts w:ascii="Arial" w:hAnsi="Arial" w:cs="Arial"/>
+          <w:rFonts w:ascii="Times New Roman" w:hAnsi="Times New Roman" w:cs="Times New Roman"/>
           <w:sz w:val="20"/>
           <w:szCs w:val="20"/>
           <w:lang w:val="en-US" w:eastAsia="en-US"/>
@@ -224,7 +253,7 @@
       </w:r>
       <w:r>
         <w:rPr>
-          <w:rFonts w:ascii="Arial" w:hAnsi="Arial" w:cs="Arial"/>
+          <w:rFonts w:ascii="Times New Roman" w:hAnsi="Times New Roman" w:cs="Times New Roman"/>
           <w:sz w:val="20"/>
           <w:szCs w:val="20"/>
           <w:lang w:val="en-US" w:eastAsia="en-US"/>
@@ -233,7 +262,7 @@
       </w:r>
       <w:r>
         <w:rPr>
-          <w:rFonts w:ascii="Arial" w:hAnsi="Arial" w:cs="Arial"/>
+          <w:rFonts w:ascii="Times New Roman" w:hAnsi="Times New Roman" w:cs="Times New Roman"/>
           <w:sz w:val="20"/>
           <w:szCs w:val="20"/>
           <w:lang w:val="en-US" w:eastAsia="en-US"/>
@@ -245,7 +274,6 @@
       <w:pPr>
         <w:jc w:val="center"/>
         <w:rPr>
-          <w:rFonts w:ascii="Arial" w:hAnsi="Arial" w:cs="Arial"/>
           <w:sz w:val="20"/>
           <w:szCs w:val="20"/>
           <w:lang w:val="en-US" w:eastAsia="en-US"/>
@@ -320,10 +348,10 @@
         <w:tblLook w:val="04A0" w:firstRow="1" w:lastRow="0" w:firstColumn="1" w:lastColumn="0" w:noHBand="0" w:noVBand="1"/>
       </w:tblPr>
       <w:tblGrid>
-        <w:gridCol w:w="1095"/>
-        <w:gridCol w:w="1846"/>
-        <w:gridCol w:w="1180"/>
-        <w:gridCol w:w="1117"/>
+        <w:gridCol w:w="995"/>
+        <w:gridCol w:w="1663"/>
+        <w:gridCol w:w="1107"/>
+        <w:gridCol w:w="1067"/>
       </w:tblGrid>
       <w:tr>
         <w:trPr>
@@ -347,7 +375,6 @@
             <w:pPr>
               <w:jc w:val="center"/>
               <w:rPr>
-                <w:rFonts w:ascii="Arial" w:hAnsi="Arial" w:cs="Arial"/>
                 <w:b/>
                 <w:bCs/>
                 <w:sz w:val="20"/>
@@ -357,36 +384,13 @@
             </w:pPr>
             <w:r>
               <w:rPr>
-                <w:rFonts w:ascii="Arial" w:hAnsi="Arial" w:cs="Arial"/>
                 <w:b/>
                 <w:bCs/>
                 <w:sz w:val="20"/>
                 <w:szCs w:val="20"/>
                 <w:lang w:val="en-US" w:eastAsia="en-US"/>
               </w:rPr>
-              <w:t xml:space="preserve">8 </w:t>
-            </w:r>
-            <w:r>
-              <w:rPr>
-                <w:rFonts w:ascii="Arial" w:hAnsi="Arial" w:cs="Arial"/>
-                <w:b/>
-                <w:bCs/>
-                <w:sz w:val="20"/>
-                <w:szCs w:val="20"/>
-                <w:lang w:val="en-US" w:eastAsia="en-US"/>
-              </w:rPr>
-              <w:t xml:space="preserve">data </w:t>
-            </w:r>
-            <w:r>
-              <w:rPr>
-                <w:rFonts w:ascii="Arial" w:hAnsi="Arial" w:cs="Arial"/>
-                <w:b/>
-                <w:bCs/>
-                <w:sz w:val="20"/>
-                <w:szCs w:val="20"/>
-                <w:lang w:val="en-US" w:eastAsia="en-US"/>
-              </w:rPr>
-              <w:t>bits</w:t>
+              <w:t>8 data bits</w:t>
             </w:r>
           </w:p>
         </w:tc>
@@ -407,7 +411,6 @@
             <w:pPr>
               <w:jc w:val="center"/>
               <w:rPr>
-                <w:rFonts w:ascii="Arial" w:hAnsi="Arial" w:cs="Arial"/>
                 <w:b/>
                 <w:bCs/>
                 <w:sz w:val="20"/>
@@ -417,7 +420,6 @@
             </w:pPr>
             <w:r>
               <w:rPr>
-                <w:rFonts w:ascii="Arial" w:hAnsi="Arial" w:cs="Arial"/>
                 <w:b/>
                 <w:bCs/>
                 <w:sz w:val="20"/>
@@ -445,7 +447,6 @@
             <w:pPr>
               <w:jc w:val="center"/>
               <w:rPr>
-                <w:rFonts w:ascii="Arial" w:hAnsi="Arial" w:cs="Arial"/>
                 <w:b/>
                 <w:bCs/>
                 <w:sz w:val="20"/>
@@ -455,7 +456,6 @@
             </w:pPr>
             <w:r>
               <w:rPr>
-                <w:rFonts w:ascii="Arial" w:hAnsi="Arial" w:cs="Arial"/>
                 <w:b/>
                 <w:bCs/>
                 <w:sz w:val="20"/>
@@ -483,7 +483,6 @@
             <w:pPr>
               <w:jc w:val="center"/>
               <w:rPr>
-                <w:rFonts w:ascii="Arial" w:hAnsi="Arial" w:cs="Arial"/>
                 <w:b/>
                 <w:bCs/>
                 <w:sz w:val="20"/>
@@ -493,7 +492,6 @@
             </w:pPr>
             <w:r>
               <w:rPr>
-                <w:rFonts w:ascii="Arial" w:hAnsi="Arial" w:cs="Arial"/>
                 <w:b/>
                 <w:bCs/>
                 <w:sz w:val="20"/>
@@ -526,7 +524,6 @@
             <w:pPr>
               <w:jc w:val="center"/>
               <w:rPr>
-                <w:rFonts w:ascii="Arial" w:hAnsi="Arial" w:cs="Arial"/>
                 <w:sz w:val="20"/>
                 <w:szCs w:val="20"/>
                 <w:lang w:val="en-US" w:eastAsia="en-US"/>
@@ -534,7 +531,6 @@
             </w:pPr>
             <w:r>
               <w:rPr>
-                <w:rFonts w:ascii="Arial" w:hAnsi="Arial" w:cs="Arial"/>
                 <w:sz w:val="20"/>
                 <w:szCs w:val="20"/>
                 <w:lang w:val="en-US" w:eastAsia="en-US"/>
@@ -559,7 +555,6 @@
             <w:pPr>
               <w:jc w:val="center"/>
               <w:rPr>
-                <w:rFonts w:ascii="Arial" w:hAnsi="Arial" w:cs="Arial"/>
                 <w:sz w:val="20"/>
                 <w:szCs w:val="20"/>
                 <w:lang w:val="en-US" w:eastAsia="en-US"/>
@@ -567,7 +562,6 @@
             </w:pPr>
             <w:r>
               <w:rPr>
-                <w:rFonts w:ascii="Arial" w:hAnsi="Arial" w:cs="Arial"/>
                 <w:sz w:val="20"/>
                 <w:szCs w:val="20"/>
                 <w:lang w:val="en-US" w:eastAsia="en-US"/>
@@ -592,7 +586,6 @@
             <w:pPr>
               <w:jc w:val="center"/>
               <w:rPr>
-                <w:rFonts w:ascii="Arial" w:hAnsi="Arial" w:cs="Arial"/>
                 <w:sz w:val="20"/>
                 <w:szCs w:val="20"/>
                 <w:lang w:val="en-US" w:eastAsia="en-US"/>
@@ -600,7 +593,6 @@
             </w:pPr>
             <w:r>
               <w:rPr>
-                <w:rFonts w:ascii="Arial" w:hAnsi="Arial" w:cs="Arial"/>
                 <w:sz w:val="20"/>
                 <w:szCs w:val="20"/>
                 <w:lang w:val="en-US" w:eastAsia="en-US"/>
@@ -609,7 +601,6 @@
             </w:r>
             <w:r>
               <w:rPr>
-                <w:rFonts w:ascii="Arial" w:hAnsi="Arial" w:cs="Arial"/>
                 <w:b/>
                 <w:bCs/>
                 <w:sz w:val="20"/>
@@ -636,7 +627,6 @@
             <w:pPr>
               <w:jc w:val="center"/>
               <w:rPr>
-                <w:rFonts w:ascii="Arial" w:hAnsi="Arial" w:cs="Arial"/>
                 <w:sz w:val="20"/>
                 <w:szCs w:val="20"/>
                 <w:lang w:val="en-US" w:eastAsia="en-US"/>
@@ -644,7 +634,6 @@
             </w:pPr>
             <w:r>
               <w:rPr>
-                <w:rFonts w:ascii="Arial" w:hAnsi="Arial" w:cs="Arial"/>
                 <w:sz w:val="20"/>
                 <w:szCs w:val="20"/>
                 <w:lang w:val="en-US" w:eastAsia="en-US"/>
@@ -653,7 +642,6 @@
             </w:r>
             <w:r>
               <w:rPr>
-                <w:rFonts w:ascii="Arial" w:hAnsi="Arial" w:cs="Arial"/>
                 <w:b/>
                 <w:bCs/>
                 <w:sz w:val="20"/>
@@ -686,7 +674,6 @@
             <w:pPr>
               <w:jc w:val="center"/>
               <w:rPr>
-                <w:rFonts w:ascii="Arial" w:hAnsi="Arial" w:cs="Arial"/>
                 <w:sz w:val="20"/>
                 <w:szCs w:val="20"/>
                 <w:lang w:val="en-US" w:eastAsia="en-US"/>
@@ -694,7 +681,6 @@
             </w:pPr>
             <w:r>
               <w:rPr>
-                <w:rFonts w:ascii="Arial" w:hAnsi="Arial" w:cs="Arial"/>
                 <w:sz w:val="20"/>
                 <w:szCs w:val="20"/>
                 <w:lang w:val="en-US" w:eastAsia="en-US"/>
@@ -719,7 +705,6 @@
             <w:pPr>
               <w:jc w:val="center"/>
               <w:rPr>
-                <w:rFonts w:ascii="Arial" w:hAnsi="Arial" w:cs="Arial"/>
                 <w:sz w:val="20"/>
                 <w:szCs w:val="20"/>
                 <w:lang w:val="en-US" w:eastAsia="en-US"/>
@@ -727,7 +712,6 @@
             </w:pPr>
             <w:r>
               <w:rPr>
-                <w:rFonts w:ascii="Arial" w:hAnsi="Arial" w:cs="Arial"/>
                 <w:sz w:val="20"/>
                 <w:szCs w:val="20"/>
                 <w:lang w:val="en-US" w:eastAsia="en-US"/>
@@ -752,7 +736,6 @@
             <w:pPr>
               <w:jc w:val="center"/>
               <w:rPr>
-                <w:rFonts w:ascii="Arial" w:hAnsi="Arial" w:cs="Arial"/>
                 <w:sz w:val="20"/>
                 <w:szCs w:val="20"/>
                 <w:lang w:val="en-US" w:eastAsia="en-US"/>
@@ -760,7 +743,6 @@
             </w:pPr>
             <w:r>
               <w:rPr>
-                <w:rFonts w:ascii="Arial" w:hAnsi="Arial" w:cs="Arial"/>
                 <w:sz w:val="20"/>
                 <w:szCs w:val="20"/>
                 <w:lang w:val="en-US" w:eastAsia="en-US"/>
@@ -769,7 +751,6 @@
             </w:r>
             <w:r>
               <w:rPr>
-                <w:rFonts w:ascii="Arial" w:hAnsi="Arial" w:cs="Arial"/>
                 <w:b/>
                 <w:bCs/>
                 <w:sz w:val="20"/>
@@ -796,7 +777,6 @@
             <w:pPr>
               <w:jc w:val="center"/>
               <w:rPr>
-                <w:rFonts w:ascii="Arial" w:hAnsi="Arial" w:cs="Arial"/>
                 <w:sz w:val="20"/>
                 <w:szCs w:val="20"/>
                 <w:lang w:val="en-US" w:eastAsia="en-US"/>
@@ -804,7 +784,6 @@
             </w:pPr>
             <w:r>
               <w:rPr>
-                <w:rFonts w:ascii="Arial" w:hAnsi="Arial" w:cs="Arial"/>
                 <w:sz w:val="20"/>
                 <w:szCs w:val="20"/>
                 <w:lang w:val="en-US" w:eastAsia="en-US"/>
@@ -813,7 +792,6 @@
             </w:r>
             <w:r>
               <w:rPr>
-                <w:rFonts w:ascii="Arial" w:hAnsi="Arial" w:cs="Arial"/>
                 <w:b/>
                 <w:bCs/>
                 <w:sz w:val="20"/>
@@ -846,7 +824,6 @@
             <w:pPr>
               <w:jc w:val="center"/>
               <w:rPr>
-                <w:rFonts w:ascii="Arial" w:hAnsi="Arial" w:cs="Arial"/>
                 <w:sz w:val="20"/>
                 <w:szCs w:val="20"/>
                 <w:lang w:val="en-US" w:eastAsia="en-US"/>
@@ -854,7 +831,6 @@
             </w:pPr>
             <w:r>
               <w:rPr>
-                <w:rFonts w:ascii="Arial" w:hAnsi="Arial" w:cs="Arial"/>
                 <w:sz w:val="20"/>
                 <w:szCs w:val="20"/>
                 <w:lang w:val="en-US" w:eastAsia="en-US"/>
@@ -879,7 +855,6 @@
             <w:pPr>
               <w:jc w:val="center"/>
               <w:rPr>
-                <w:rFonts w:ascii="Arial" w:hAnsi="Arial" w:cs="Arial"/>
                 <w:sz w:val="20"/>
                 <w:szCs w:val="20"/>
                 <w:lang w:val="en-US" w:eastAsia="en-US"/>
@@ -887,7 +862,6 @@
             </w:pPr>
             <w:r>
               <w:rPr>
-                <w:rFonts w:ascii="Arial" w:hAnsi="Arial" w:cs="Arial"/>
                 <w:sz w:val="20"/>
                 <w:szCs w:val="20"/>
                 <w:lang w:val="en-US" w:eastAsia="en-US"/>
@@ -912,7 +886,6 @@
             <w:pPr>
               <w:jc w:val="center"/>
               <w:rPr>
-                <w:rFonts w:ascii="Arial" w:hAnsi="Arial" w:cs="Arial"/>
                 <w:sz w:val="20"/>
                 <w:szCs w:val="20"/>
                 <w:lang w:val="en-US" w:eastAsia="en-US"/>
@@ -920,7 +893,6 @@
             </w:pPr>
             <w:r>
               <w:rPr>
-                <w:rFonts w:ascii="Arial" w:hAnsi="Arial" w:cs="Arial"/>
                 <w:sz w:val="20"/>
                 <w:szCs w:val="20"/>
                 <w:lang w:val="en-US" w:eastAsia="en-US"/>
@@ -929,7 +901,6 @@
             </w:r>
             <w:r>
               <w:rPr>
-                <w:rFonts w:ascii="Arial" w:hAnsi="Arial" w:cs="Arial"/>
                 <w:b/>
                 <w:bCs/>
                 <w:sz w:val="20"/>
@@ -956,7 +927,6 @@
             <w:pPr>
               <w:jc w:val="center"/>
               <w:rPr>
-                <w:rFonts w:ascii="Arial" w:hAnsi="Arial" w:cs="Arial"/>
                 <w:sz w:val="20"/>
                 <w:szCs w:val="20"/>
                 <w:lang w:val="en-US" w:eastAsia="en-US"/>
@@ -964,7 +934,6 @@
             </w:pPr>
             <w:r>
               <w:rPr>
-                <w:rFonts w:ascii="Arial" w:hAnsi="Arial" w:cs="Arial"/>
                 <w:sz w:val="20"/>
                 <w:szCs w:val="20"/>
                 <w:lang w:val="en-US" w:eastAsia="en-US"/>
@@ -973,7 +942,6 @@
             </w:r>
             <w:r>
               <w:rPr>
-                <w:rFonts w:ascii="Arial" w:hAnsi="Arial" w:cs="Arial"/>
                 <w:b/>
                 <w:bCs/>
                 <w:sz w:val="20"/>
@@ -1006,7 +974,6 @@
             <w:pPr>
               <w:jc w:val="center"/>
               <w:rPr>
-                <w:rFonts w:ascii="Arial" w:hAnsi="Arial" w:cs="Arial"/>
                 <w:sz w:val="20"/>
                 <w:szCs w:val="20"/>
                 <w:lang w:val="en-US" w:eastAsia="en-US"/>
@@ -1014,7 +981,6 @@
             </w:pPr>
             <w:r>
               <w:rPr>
-                <w:rFonts w:ascii="Arial" w:hAnsi="Arial" w:cs="Arial"/>
                 <w:sz w:val="20"/>
                 <w:szCs w:val="20"/>
                 <w:lang w:val="en-US" w:eastAsia="en-US"/>
@@ -1039,7 +1005,6 @@
             <w:pPr>
               <w:jc w:val="center"/>
               <w:rPr>
-                <w:rFonts w:ascii="Arial" w:hAnsi="Arial" w:cs="Arial"/>
                 <w:sz w:val="20"/>
                 <w:szCs w:val="20"/>
                 <w:lang w:val="en-US" w:eastAsia="en-US"/>
@@ -1047,7 +1012,6 @@
             </w:pPr>
             <w:r>
               <w:rPr>
-                <w:rFonts w:ascii="Arial" w:hAnsi="Arial" w:cs="Arial"/>
                 <w:sz w:val="20"/>
                 <w:szCs w:val="20"/>
                 <w:lang w:val="en-US" w:eastAsia="en-US"/>
@@ -1072,7 +1036,6 @@
             <w:pPr>
               <w:jc w:val="center"/>
               <w:rPr>
-                <w:rFonts w:ascii="Arial" w:hAnsi="Arial" w:cs="Arial"/>
                 <w:sz w:val="20"/>
                 <w:szCs w:val="20"/>
                 <w:lang w:val="en-US" w:eastAsia="en-US"/>
@@ -1080,7 +1043,6 @@
             </w:pPr>
             <w:r>
               <w:rPr>
-                <w:rFonts w:ascii="Arial" w:hAnsi="Arial" w:cs="Arial"/>
                 <w:sz w:val="20"/>
                 <w:szCs w:val="20"/>
                 <w:lang w:val="en-US" w:eastAsia="en-US"/>
@@ -1089,7 +1051,6 @@
             </w:r>
             <w:r>
               <w:rPr>
-                <w:rFonts w:ascii="Arial" w:hAnsi="Arial" w:cs="Arial"/>
                 <w:b/>
                 <w:bCs/>
                 <w:sz w:val="20"/>
@@ -1116,7 +1077,6 @@
             <w:pPr>
               <w:jc w:val="center"/>
               <w:rPr>
-                <w:rFonts w:ascii="Arial" w:hAnsi="Arial" w:cs="Arial"/>
                 <w:sz w:val="20"/>
                 <w:szCs w:val="20"/>
                 <w:lang w:val="en-US" w:eastAsia="en-US"/>
@@ -1124,7 +1084,6 @@
             </w:pPr>
             <w:r>
               <w:rPr>
-                <w:rFonts w:ascii="Arial" w:hAnsi="Arial" w:cs="Arial"/>
                 <w:sz w:val="20"/>
                 <w:szCs w:val="20"/>
                 <w:lang w:val="en-US" w:eastAsia="en-US"/>
@@ -1133,7 +1092,6 @@
             </w:r>
             <w:r>
               <w:rPr>
-                <w:rFonts w:ascii="Arial" w:hAnsi="Arial" w:cs="Arial"/>
                 <w:b/>
                 <w:bCs/>
                 <w:sz w:val="20"/>
@@ -1150,7 +1108,6 @@
       <w:pPr>
         <w:jc w:val="center"/>
         <w:rPr>
-          <w:rFonts w:ascii="Arial" w:hAnsi="Arial" w:cs="Arial"/>
           <w:sz w:val="20"/>
           <w:szCs w:val="20"/>
           <w:lang w:val="en-US" w:eastAsia="en-US"/>
@@ -1161,7 +1118,6 @@
       <w:pPr>
         <w:jc w:val="center"/>
         <w:rPr>
-          <w:rFonts w:ascii="Arial" w:hAnsi="Arial" w:cs="Arial"/>
           <w:sz w:val="20"/>
           <w:szCs w:val="20"/>
           <w:lang w:val="en-US" w:eastAsia="en-US"/>
@@ -1169,7 +1125,6 @@
       </w:pPr>
       <w:r>
         <w:rPr>
-          <w:rFonts w:ascii="Arial" w:hAnsi="Arial" w:cs="Arial"/>
           <w:sz w:val="20"/>
           <w:szCs w:val="20"/>
           <w:lang w:val="en-US" w:eastAsia="en-US"/>
@@ -1186,7 +1141,6 @@
       </w:pPr>
       <w:r>
         <w:rPr>
-          <w:rFonts w:ascii="Arial" w:hAnsi="Arial" w:cs="Arial"/>
           <w:b/>
           <w:sz w:val="20"/>
           <w:szCs w:val="20"/>
@@ -1199,18 +1153,58 @@
       <w:pPr>
         <w:jc w:val="both"/>
         <w:rPr>
-          <w:rFonts w:ascii="Arial" w:hAnsi="Arial" w:cs="Arial"/>
           <w:sz w:val="20"/>
           <w:szCs w:val="20"/>
           <w:lang w:val="en-US" w:eastAsia="en-US"/>
         </w:rPr>
       </w:pPr>
+      <w:r>
+        <w:rPr>
+          <w:sz w:val="20"/>
+          <w:szCs w:val="20"/>
+          <w:lang w:val="en-US" w:eastAsia="en-US"/>
+        </w:rPr>
+        <w:drawing>
+          <wp:inline distT="0" distB="0" distL="0" distR="0" wp14:anchorId="2F9C15BC" wp14:editId="28F4C396">
+            <wp:extent cx="5459809" cy="2941983"/>
+            <wp:effectExtent l="0" t="0" r="7620" b="0"/>
+            <wp:docPr id="1022701124" name="Picture 1"/>
+            <wp:cNvGraphicFramePr>
+              <a:graphicFrameLocks xmlns:a="http://schemas.openxmlformats.org/drawingml/2006/main" noChangeAspect="1"/>
+            </wp:cNvGraphicFramePr>
+            <a:graphic xmlns:a="http://schemas.openxmlformats.org/drawingml/2006/main">
+              <a:graphicData uri="http://schemas.openxmlformats.org/drawingml/2006/picture">
+                <pic:pic xmlns:pic="http://schemas.openxmlformats.org/drawingml/2006/picture">
+                  <pic:nvPicPr>
+                    <pic:cNvPr id="1022701124" name=""/>
+                    <pic:cNvPicPr/>
+                  </pic:nvPicPr>
+                  <pic:blipFill>
+                    <a:blip r:embed="rId9"/>
+                    <a:stretch>
+                      <a:fillRect/>
+                    </a:stretch>
+                  </pic:blipFill>
+                  <pic:spPr>
+                    <a:xfrm>
+                      <a:off x="0" y="0"/>
+                      <a:ext cx="5481177" cy="2953497"/>
+                    </a:xfrm>
+                    <a:prstGeom prst="rect">
+                      <a:avLst/>
+                    </a:prstGeom>
+                  </pic:spPr>
+                </pic:pic>
+              </a:graphicData>
+            </a:graphic>
+          </wp:inline>
+        </w:drawing>
+      </w:r>
     </w:p>
     <w:p>
       <w:pPr>
         <w:jc w:val="both"/>
         <w:rPr>
-          <w:rFonts w:ascii="Arial" w:hAnsi="Arial" w:cs="Arial"/>
           <w:sz w:val="20"/>
           <w:szCs w:val="20"/>
           <w:lang w:val="en-US" w:eastAsia="en-US"/>
@@ -1218,19 +1212,1296 @@
       </w:pPr>
       <w:r>
         <w:rPr>
-          <w:rFonts w:ascii="Arial" w:hAnsi="Arial" w:cs="Arial"/>
           <w:sz w:val="20"/>
           <w:szCs w:val="20"/>
           <w:lang w:val="en-US" w:eastAsia="en-US"/>
         </w:rPr>
+        <w:lastRenderedPageBreak/>
+        <w:drawing>
+          <wp:inline distT="0" distB="0" distL="0" distR="0" wp14:anchorId="1334B4FD" wp14:editId="26C21CAC">
+            <wp:extent cx="4887785" cy="2615979"/>
+            <wp:effectExtent l="0" t="0" r="8255" b="0"/>
+            <wp:docPr id="730637658" name="Picture 1"/>
+            <wp:cNvGraphicFramePr>
+              <a:graphicFrameLocks xmlns:a="http://schemas.openxmlformats.org/drawingml/2006/main" noChangeAspect="1"/>
+            </wp:cNvGraphicFramePr>
+            <a:graphic xmlns:a="http://schemas.openxmlformats.org/drawingml/2006/main">
+              <a:graphicData uri="http://schemas.openxmlformats.org/drawingml/2006/picture">
+                <pic:pic xmlns:pic="http://schemas.openxmlformats.org/drawingml/2006/picture">
+                  <pic:nvPicPr>
+                    <pic:cNvPr id="730637658" name=""/>
+                    <pic:cNvPicPr/>
+                  </pic:nvPicPr>
+                  <pic:blipFill>
+                    <a:blip r:embed="rId10"/>
+                    <a:stretch>
+                      <a:fillRect/>
+                    </a:stretch>
+                  </pic:blipFill>
+                  <pic:spPr>
+                    <a:xfrm>
+                      <a:off x="0" y="0"/>
+                      <a:ext cx="4899868" cy="2622446"/>
+                    </a:xfrm>
+                    <a:prstGeom prst="rect">
+                      <a:avLst/>
+                    </a:prstGeom>
+                  </pic:spPr>
+                </pic:pic>
+              </a:graphicData>
+            </a:graphic>
+          </wp:inline>
+        </w:drawing>
+      </w:r>
+    </w:p>
+    <w:p>
+      <w:pPr>
+        <w:jc w:val="both"/>
+        <w:rPr>
+          <w:sz w:val="20"/>
+          <w:szCs w:val="20"/>
+          <w:lang w:val="en-US" w:eastAsia="en-US"/>
+        </w:rPr>
+      </w:pPr>
+      <w:r>
+        <w:rPr>
+          <w:sz w:val="20"/>
+          <w:szCs w:val="20"/>
+          <w:lang w:val="en-US" w:eastAsia="en-US"/>
+        </w:rPr>
+        <w:drawing>
+          <wp:inline distT="0" distB="0" distL="0" distR="0" wp14:anchorId="2C9898D3" wp14:editId="228A0FA1">
+            <wp:extent cx="4898004" cy="2621449"/>
+            <wp:effectExtent l="0" t="0" r="0" b="7620"/>
+            <wp:docPr id="34593907" name="Picture 1"/>
+            <wp:cNvGraphicFramePr>
+              <a:graphicFrameLocks xmlns:a="http://schemas.openxmlformats.org/drawingml/2006/main" noChangeAspect="1"/>
+            </wp:cNvGraphicFramePr>
+            <a:graphic xmlns:a="http://schemas.openxmlformats.org/drawingml/2006/main">
+              <a:graphicData uri="http://schemas.openxmlformats.org/drawingml/2006/picture">
+                <pic:pic xmlns:pic="http://schemas.openxmlformats.org/drawingml/2006/picture">
+                  <pic:nvPicPr>
+                    <pic:cNvPr id="34593907" name=""/>
+                    <pic:cNvPicPr/>
+                  </pic:nvPicPr>
+                  <pic:blipFill>
+                    <a:blip r:embed="rId11"/>
+                    <a:stretch>
+                      <a:fillRect/>
+                    </a:stretch>
+                  </pic:blipFill>
+                  <pic:spPr>
+                    <a:xfrm>
+                      <a:off x="0" y="0"/>
+                      <a:ext cx="4904740" cy="2625054"/>
+                    </a:xfrm>
+                    <a:prstGeom prst="rect">
+                      <a:avLst/>
+                    </a:prstGeom>
+                  </pic:spPr>
+                </pic:pic>
+              </a:graphicData>
+            </a:graphic>
+          </wp:inline>
+        </w:drawing>
+      </w:r>
+    </w:p>
+    <w:p>
+      <w:pPr>
+        <w:rPr>
+          <w:sz w:val="22"/>
+          <w:szCs w:val="22"/>
+          <w:lang w:val="en-US" w:eastAsia="en-US"/>
+        </w:rPr>
+      </w:pPr>
+      <w:r>
+        <w:rPr>
+          <w:sz w:val="20"/>
+          <w:szCs w:val="20"/>
+          <w:lang w:val="en-US" w:eastAsia="en-US"/>
+        </w:rPr>
+        <w:drawing>
+          <wp:inline distT="0" distB="0" distL="0" distR="0" wp14:anchorId="218A3001" wp14:editId="28FB4A2B">
+            <wp:extent cx="5126832" cy="2687541"/>
+            <wp:effectExtent l="0" t="0" r="0" b="0"/>
+            <wp:docPr id="1521244008" name="Picture 1"/>
+            <wp:cNvGraphicFramePr>
+              <a:graphicFrameLocks xmlns:a="http://schemas.openxmlformats.org/drawingml/2006/main" noChangeAspect="1"/>
+            </wp:cNvGraphicFramePr>
+            <a:graphic xmlns:a="http://schemas.openxmlformats.org/drawingml/2006/main">
+              <a:graphicData uri="http://schemas.openxmlformats.org/drawingml/2006/picture">
+                <pic:pic xmlns:pic="http://schemas.openxmlformats.org/drawingml/2006/picture">
+                  <pic:nvPicPr>
+                    <pic:cNvPr id="1521244008" name=""/>
+                    <pic:cNvPicPr/>
+                  </pic:nvPicPr>
+                  <pic:blipFill>
+                    <a:blip r:embed="rId12"/>
+                    <a:stretch>
+                      <a:fillRect/>
+                    </a:stretch>
+                  </pic:blipFill>
+                  <pic:spPr>
+                    <a:xfrm>
+                      <a:off x="0" y="0"/>
+                      <a:ext cx="5135856" cy="2692271"/>
+                    </a:xfrm>
+                    <a:prstGeom prst="rect">
+                      <a:avLst/>
+                    </a:prstGeom>
+                  </pic:spPr>
+                </pic:pic>
+              </a:graphicData>
+            </a:graphic>
+          </wp:inline>
+        </w:drawing>
+      </w:r>
+    </w:p>
+    <w:p>
+      <w:pPr>
+        <w:rPr>
+          <w:sz w:val="22"/>
+          <w:szCs w:val="22"/>
+          <w:lang w:val="en-US" w:eastAsia="en-US"/>
+        </w:rPr>
+      </w:pPr>
+    </w:p>
+    <w:p>
+      <w:pPr>
+        <w:rPr>
+          <w:sz w:val="22"/>
+          <w:szCs w:val="22"/>
+          <w:lang w:val="en-US" w:eastAsia="en-US"/>
+        </w:rPr>
+      </w:pPr>
+    </w:p>
+    <w:p>
+      <w:pPr>
+        <w:rPr>
+          <w:sz w:val="22"/>
+          <w:szCs w:val="22"/>
+          <w:lang w:val="en-US" w:eastAsia="en-US"/>
+        </w:rPr>
+      </w:pPr>
+    </w:p>
+    <w:p>
+      <w:pPr>
+        <w:jc w:val="center"/>
+        <w:rPr>
+          <w:sz w:val="22"/>
+          <w:szCs w:val="22"/>
+          <w:lang w:val="en-US" w:eastAsia="en-US"/>
+        </w:rPr>
+      </w:pPr>
+      <w:proofErr w:type="spellStart"/>
+      <w:r>
+        <w:rPr>
+          <w:sz w:val="22"/>
+          <w:szCs w:val="22"/>
+          <w:lang w:val="en-US" w:eastAsia="en-US"/>
+        </w:rPr>
+        <w:lastRenderedPageBreak/>
+        <w:t>Diagrama</w:t>
+      </w:r>
+      <w:proofErr w:type="spellEnd"/>
+      <w:r>
+        <w:rPr>
+          <w:sz w:val="22"/>
+          <w:szCs w:val="22"/>
+          <w:lang w:val="en-US" w:eastAsia="en-US"/>
+        </w:rPr>
+        <w:t xml:space="preserve"> de </w:t>
+      </w:r>
+      <w:proofErr w:type="spellStart"/>
+      <w:r>
+        <w:rPr>
+          <w:sz w:val="22"/>
+          <w:szCs w:val="22"/>
+          <w:lang w:val="en-US" w:eastAsia="en-US"/>
+        </w:rPr>
+        <w:t>puertos</w:t>
+      </w:r>
+      <w:proofErr w:type="spellEnd"/>
+      <w:r>
+        <w:rPr>
+          <w:sz w:val="22"/>
+          <w:szCs w:val="22"/>
+          <w:lang w:val="en-US" w:eastAsia="en-US"/>
+        </w:rPr>
+        <w:t>:</w:t>
+      </w:r>
+    </w:p>
+    <w:p>
+      <w:pPr>
+        <w:jc w:val="center"/>
+        <w:rPr>
+          <w:sz w:val="22"/>
+          <w:szCs w:val="22"/>
+          <w:lang w:val="en-US" w:eastAsia="en-US"/>
+        </w:rPr>
+      </w:pPr>
+      <w:r>
+        <w:rPr>
+          <w:b/>
+          <w:noProof/>
+          <w:sz w:val="20"/>
+          <w:szCs w:val="20"/>
+          <w:lang w:val="en-US" w:eastAsia="en-US"/>
+        </w:rPr>
+        <w:drawing>
+          <wp:inline distT="0" distB="0" distL="0" distR="0" wp14:anchorId="6D4FB8C0" wp14:editId="266F98DC">
+            <wp:extent cx="7151370" cy="655320"/>
+            <wp:effectExtent l="0" t="0" r="0" b="0"/>
+            <wp:docPr id="1497949215" name="Picture 5"/>
+            <wp:cNvGraphicFramePr>
+              <a:graphicFrameLocks xmlns:a="http://schemas.openxmlformats.org/drawingml/2006/main" noChangeAspect="1"/>
+            </wp:cNvGraphicFramePr>
+            <a:graphic xmlns:a="http://schemas.openxmlformats.org/drawingml/2006/main">
+              <a:graphicData uri="http://schemas.openxmlformats.org/drawingml/2006/picture">
+                <pic:pic xmlns:pic="http://schemas.openxmlformats.org/drawingml/2006/picture">
+                  <pic:nvPicPr>
+                    <pic:cNvPr id="0" name="Picture 2"/>
+                    <pic:cNvPicPr>
+                      <a:picLocks noChangeAspect="1" noChangeArrowheads="1"/>
+                    </pic:cNvPicPr>
+                  </pic:nvPicPr>
+                  <pic:blipFill>
+                    <a:blip r:embed="rId13" cstate="print">
+                      <a:extLst>
+                        <a:ext uri="{28A0092B-C50C-407E-A947-70E740481C1C}">
+                          <a14:useLocalDpi xmlns:a14="http://schemas.microsoft.com/office/drawing/2010/main" val="0"/>
+                        </a:ext>
+                      </a:extLst>
+                    </a:blip>
+                    <a:srcRect/>
+                    <a:stretch>
+                      <a:fillRect/>
+                    </a:stretch>
+                  </pic:blipFill>
+                  <pic:spPr bwMode="auto">
+                    <a:xfrm>
+                      <a:off x="0" y="0"/>
+                      <a:ext cx="7151370" cy="655320"/>
+                    </a:xfrm>
+                    <a:prstGeom prst="rect">
+                      <a:avLst/>
+                    </a:prstGeom>
+                    <a:noFill/>
+                    <a:ln>
+                      <a:noFill/>
+                    </a:ln>
+                  </pic:spPr>
+                </pic:pic>
+              </a:graphicData>
+            </a:graphic>
+          </wp:inline>
+        </w:drawing>
+      </w:r>
+    </w:p>
+    <w:p>
+      <w:pPr>
+        <w:jc w:val="both"/>
+        <w:rPr>
+          <w:sz w:val="22"/>
+          <w:szCs w:val="22"/>
+          <w:lang w:eastAsia="en-US"/>
+        </w:rPr>
+      </w:pPr>
+      <w:r>
+        <w:rPr>
+          <w:sz w:val="22"/>
+          <w:szCs w:val="22"/>
+          <w:lang w:eastAsia="en-US"/>
+        </w:rPr>
+        <w:t xml:space="preserve">Este diagrama resume la interfaz del módulo </w:t>
+      </w:r>
+      <w:proofErr w:type="spellStart"/>
+      <w:r>
+        <w:rPr>
+          <w:sz w:val="22"/>
+          <w:szCs w:val="22"/>
+          <w:lang w:eastAsia="en-US"/>
+        </w:rPr>
+        <w:t>uart_rx</w:t>
+      </w:r>
+      <w:proofErr w:type="spellEnd"/>
+      <w:r>
+        <w:rPr>
+          <w:sz w:val="22"/>
+          <w:szCs w:val="22"/>
+          <w:lang w:eastAsia="en-US"/>
+        </w:rPr>
+        <w:t xml:space="preserve">. Las entradas son: </w:t>
+      </w:r>
+      <w:proofErr w:type="spellStart"/>
+      <w:r>
+        <w:rPr>
+          <w:sz w:val="22"/>
+          <w:szCs w:val="22"/>
+          <w:lang w:eastAsia="en-US"/>
+        </w:rPr>
+        <w:t>clk</w:t>
+      </w:r>
+      <w:proofErr w:type="spellEnd"/>
+      <w:r>
+        <w:rPr>
+          <w:sz w:val="22"/>
+          <w:szCs w:val="22"/>
+          <w:lang w:eastAsia="en-US"/>
+        </w:rPr>
+        <w:t xml:space="preserve"> (reloj del sistema), </w:t>
+      </w:r>
+      <w:proofErr w:type="spellStart"/>
+      <w:r>
+        <w:rPr>
+          <w:sz w:val="22"/>
+          <w:szCs w:val="22"/>
+          <w:lang w:eastAsia="en-US"/>
+        </w:rPr>
+        <w:t>rst</w:t>
+      </w:r>
+      <w:proofErr w:type="spellEnd"/>
+      <w:r>
+        <w:rPr>
+          <w:sz w:val="22"/>
+          <w:szCs w:val="22"/>
+          <w:lang w:eastAsia="en-US"/>
+        </w:rPr>
+        <w:t xml:space="preserve"> (</w:t>
+      </w:r>
+      <w:proofErr w:type="spellStart"/>
+      <w:r>
+        <w:rPr>
+          <w:sz w:val="22"/>
+          <w:szCs w:val="22"/>
+          <w:lang w:eastAsia="en-US"/>
+        </w:rPr>
+        <w:t>reset</w:t>
+      </w:r>
+      <w:proofErr w:type="spellEnd"/>
+      <w:r>
+        <w:rPr>
+          <w:sz w:val="22"/>
+          <w:szCs w:val="22"/>
+          <w:lang w:eastAsia="en-US"/>
+        </w:rPr>
+        <w:t xml:space="preserve"> síncrono activo en alto) y </w:t>
+      </w:r>
+      <w:proofErr w:type="spellStart"/>
+      <w:r>
+        <w:rPr>
+          <w:sz w:val="22"/>
+          <w:szCs w:val="22"/>
+          <w:lang w:eastAsia="en-US"/>
+        </w:rPr>
+        <w:t>rx</w:t>
+      </w:r>
+      <w:proofErr w:type="spellEnd"/>
+      <w:r>
+        <w:rPr>
+          <w:sz w:val="22"/>
+          <w:szCs w:val="22"/>
+          <w:lang w:eastAsia="en-US"/>
+        </w:rPr>
+        <w:t xml:space="preserve"> (línea serial de un bit). Las salidas son: </w:t>
+      </w:r>
+      <w:proofErr w:type="spellStart"/>
+      <w:r>
+        <w:rPr>
+          <w:sz w:val="22"/>
+          <w:szCs w:val="22"/>
+          <w:lang w:eastAsia="en-US"/>
+        </w:rPr>
+        <w:t>rx_</w:t>
+      </w:r>
+      <w:proofErr w:type="gramStart"/>
+      <w:r>
+        <w:rPr>
+          <w:sz w:val="22"/>
+          <w:szCs w:val="22"/>
+          <w:lang w:eastAsia="en-US"/>
+        </w:rPr>
+        <w:t>data</w:t>
+      </w:r>
+      <w:proofErr w:type="spellEnd"/>
+      <w:r>
+        <w:rPr>
+          <w:sz w:val="22"/>
+          <w:szCs w:val="22"/>
+          <w:lang w:eastAsia="en-US"/>
+        </w:rPr>
+        <w:t>[</w:t>
+      </w:r>
+      <w:proofErr w:type="gramEnd"/>
+      <w:r>
+        <w:rPr>
+          <w:sz w:val="22"/>
+          <w:szCs w:val="22"/>
+          <w:lang w:eastAsia="en-US"/>
+        </w:rPr>
+        <w:t xml:space="preserve">7:0] (byte recibido en paralelo), </w:t>
+      </w:r>
+      <w:proofErr w:type="spellStart"/>
+      <w:r>
+        <w:rPr>
+          <w:sz w:val="22"/>
+          <w:szCs w:val="22"/>
+          <w:lang w:eastAsia="en-US"/>
+        </w:rPr>
+        <w:t>received</w:t>
+      </w:r>
+      <w:proofErr w:type="spellEnd"/>
+      <w:r>
+        <w:rPr>
+          <w:sz w:val="22"/>
+          <w:szCs w:val="22"/>
+          <w:lang w:eastAsia="en-US"/>
+        </w:rPr>
+        <w:t xml:space="preserve"> (pulso de un ciclo que indica que hay un dato nuevo) y </w:t>
+      </w:r>
+      <w:proofErr w:type="spellStart"/>
+      <w:r>
+        <w:rPr>
+          <w:sz w:val="22"/>
+          <w:szCs w:val="22"/>
+          <w:lang w:eastAsia="en-US"/>
+        </w:rPr>
+        <w:t>parity_error</w:t>
+      </w:r>
+      <w:proofErr w:type="spellEnd"/>
+      <w:r>
+        <w:rPr>
+          <w:sz w:val="22"/>
+          <w:szCs w:val="22"/>
+          <w:lang w:eastAsia="en-US"/>
+        </w:rPr>
+        <w:t xml:space="preserve"> (solo válido si se usa paridad). Los parámetros configurables son CLKS_PER_BIT (definido como 5 ciclos por bit en este diseño) y PARITY_MODE (puede ser NONE, EVEN u ODD).</w:t>
+      </w:r>
+    </w:p>
+    <w:p>
+      <w:pPr>
+        <w:jc w:val="both"/>
+        <w:rPr>
+          <w:sz w:val="22"/>
+          <w:szCs w:val="22"/>
+          <w:lang w:eastAsia="en-US"/>
+        </w:rPr>
+      </w:pPr>
+    </w:p>
+    <w:p>
+      <w:pPr>
+        <w:jc w:val="center"/>
+        <w:rPr>
+          <w:sz w:val="22"/>
+          <w:szCs w:val="22"/>
+          <w:lang w:eastAsia="en-US"/>
+        </w:rPr>
+      </w:pPr>
+      <w:r>
+        <w:rPr>
+          <w:sz w:val="22"/>
+          <w:szCs w:val="22"/>
+          <w:lang w:eastAsia="en-US"/>
+        </w:rPr>
+        <w:t xml:space="preserve">Diagrama de FSM para la </w:t>
+      </w:r>
+      <w:proofErr w:type="spellStart"/>
+      <w:r>
+        <w:rPr>
+          <w:sz w:val="22"/>
+          <w:szCs w:val="22"/>
+          <w:lang w:eastAsia="en-US"/>
+        </w:rPr>
+        <w:t>uart</w:t>
+      </w:r>
+      <w:proofErr w:type="spellEnd"/>
+    </w:p>
+    <w:p>
+      <w:pPr>
+        <w:rPr>
+          <w:sz w:val="22"/>
+          <w:szCs w:val="22"/>
+          <w:lang w:val="en-US" w:eastAsia="en-US"/>
+        </w:rPr>
+      </w:pPr>
+      <w:r>
+        <w:rPr>
+          <w:noProof/>
+          <w:sz w:val="22"/>
+          <w:szCs w:val="22"/>
+          <w:lang w:val="en-US" w:eastAsia="en-US"/>
+        </w:rPr>
+        <w:drawing>
+          <wp:inline distT="0" distB="0" distL="0" distR="0" wp14:anchorId="1B8130EE" wp14:editId="53D4D910">
+            <wp:extent cx="4851070" cy="3942080"/>
+            <wp:effectExtent l="0" t="0" r="6985" b="1270"/>
+            <wp:docPr id="144552626" name="Picture 6"/>
+            <wp:cNvGraphicFramePr>
+              <a:graphicFrameLocks xmlns:a="http://schemas.openxmlformats.org/drawingml/2006/main" noChangeAspect="1"/>
+            </wp:cNvGraphicFramePr>
+            <a:graphic xmlns:a="http://schemas.openxmlformats.org/drawingml/2006/main">
+              <a:graphicData uri="http://schemas.openxmlformats.org/drawingml/2006/picture">
+                <pic:pic xmlns:pic="http://schemas.openxmlformats.org/drawingml/2006/picture">
+                  <pic:nvPicPr>
+                    <pic:cNvPr id="0" name="Picture 3"/>
+                    <pic:cNvPicPr>
+                      <a:picLocks noChangeAspect="1" noChangeArrowheads="1"/>
+                    </pic:cNvPicPr>
+                  </pic:nvPicPr>
+                  <pic:blipFill>
+                    <a:blip r:embed="rId14" cstate="print">
+                      <a:extLst>
+                        <a:ext uri="{28A0092B-C50C-407E-A947-70E740481C1C}">
+                          <a14:useLocalDpi xmlns:a14="http://schemas.microsoft.com/office/drawing/2010/main" val="0"/>
+                        </a:ext>
+                      </a:extLst>
+                    </a:blip>
+                    <a:srcRect/>
+                    <a:stretch>
+                      <a:fillRect/>
+                    </a:stretch>
+                  </pic:blipFill>
+                  <pic:spPr bwMode="auto">
+                    <a:xfrm>
+                      <a:off x="0" y="0"/>
+                      <a:ext cx="4881359" cy="3966693"/>
+                    </a:xfrm>
+                    <a:prstGeom prst="rect">
+                      <a:avLst/>
+                    </a:prstGeom>
+                    <a:noFill/>
+                    <a:ln>
+                      <a:noFill/>
+                    </a:ln>
+                  </pic:spPr>
+                </pic:pic>
+              </a:graphicData>
+            </a:graphic>
+          </wp:inline>
+        </w:drawing>
+      </w:r>
+    </w:p>
+    <w:p>
+      <w:pPr>
+        <w:rPr>
+          <w:sz w:val="22"/>
+          <w:szCs w:val="22"/>
+          <w:lang w:eastAsia="en-US"/>
+        </w:rPr>
+      </w:pPr>
+      <w:r>
+        <w:rPr>
+          <w:sz w:val="22"/>
+          <w:szCs w:val="22"/>
+          <w:lang w:eastAsia="en-US"/>
+        </w:rPr>
+        <w:t>Este diagrama describe el comportamiento interno de la máquina de estados.</w:t>
+      </w:r>
+    </w:p>
+    <w:p>
+      <w:pPr>
+        <w:pStyle w:val="ListParagraph"/>
+        <w:numPr>
+          <w:ilvl w:val="0"/>
+          <w:numId w:val="7"/>
+        </w:numPr>
+        <w:rPr>
+          <w:rFonts w:ascii="Times New Roman" w:hAnsi="Times New Roman" w:cs="Times New Roman"/>
+          <w:lang w:eastAsia="en-US"/>
+        </w:rPr>
+      </w:pPr>
+      <w:r>
+        <w:rPr>
+          <w:rFonts w:ascii="Times New Roman" w:hAnsi="Times New Roman" w:cs="Times New Roman"/>
+          <w:lang w:eastAsia="en-US"/>
+        </w:rPr>
+        <w:t>S_IDLE: espera la línea en reposo (</w:t>
+      </w:r>
+      <w:proofErr w:type="spellStart"/>
+      <w:r>
+        <w:rPr>
+          <w:rFonts w:ascii="Times New Roman" w:hAnsi="Times New Roman" w:cs="Times New Roman"/>
+          <w:lang w:eastAsia="en-US"/>
+        </w:rPr>
+        <w:t>rx_bit</w:t>
+      </w:r>
+      <w:proofErr w:type="spellEnd"/>
+      <w:r>
+        <w:rPr>
+          <w:rFonts w:ascii="Times New Roman" w:hAnsi="Times New Roman" w:cs="Times New Roman"/>
+          <w:lang w:eastAsia="en-US"/>
+        </w:rPr>
+        <w:t>=1). Si detecta un 0, pasa a S_START.</w:t>
+      </w:r>
+    </w:p>
+    <w:p>
+      <w:pPr>
+        <w:pStyle w:val="ListParagraph"/>
+        <w:numPr>
+          <w:ilvl w:val="0"/>
+          <w:numId w:val="7"/>
+        </w:numPr>
+        <w:rPr>
+          <w:rFonts w:ascii="Times New Roman" w:hAnsi="Times New Roman" w:cs="Times New Roman"/>
+          <w:lang w:eastAsia="en-US"/>
+        </w:rPr>
+      </w:pPr>
+      <w:r>
+        <w:rPr>
+          <w:rFonts w:ascii="Times New Roman" w:hAnsi="Times New Roman" w:cs="Times New Roman"/>
+          <w:lang w:eastAsia="en-US"/>
+        </w:rPr>
+        <w:t>S_START: confirma el bit de inicio muestreando en la mitad del periodo (ciclo 3 de 5). Si sigue en 0, pasa a S_DATA; si no, regresa a S_IDLE.</w:t>
+      </w:r>
+    </w:p>
+    <w:p>
+      <w:pPr>
+        <w:pStyle w:val="ListParagraph"/>
+        <w:numPr>
+          <w:ilvl w:val="0"/>
+          <w:numId w:val="7"/>
+        </w:numPr>
+        <w:rPr>
+          <w:rFonts w:ascii="Times New Roman" w:hAnsi="Times New Roman" w:cs="Times New Roman"/>
+          <w:lang w:eastAsia="en-US"/>
+        </w:rPr>
+      </w:pPr>
+      <w:r>
+        <w:rPr>
+          <w:rFonts w:ascii="Times New Roman" w:hAnsi="Times New Roman" w:cs="Times New Roman"/>
+          <w:lang w:eastAsia="en-US"/>
+        </w:rPr>
+        <w:t xml:space="preserve">S_DATA: recibe los 8 bits de datos, uno por uno, cada 5 ciclos. Controlado por </w:t>
+      </w:r>
+      <w:proofErr w:type="spellStart"/>
+      <w:r>
+        <w:rPr>
+          <w:rFonts w:ascii="Times New Roman" w:hAnsi="Times New Roman" w:cs="Times New Roman"/>
+          <w:lang w:eastAsia="en-US"/>
+        </w:rPr>
+        <w:t>bit_index</w:t>
+      </w:r>
+      <w:proofErr w:type="spellEnd"/>
+      <w:r>
+        <w:rPr>
+          <w:rFonts w:ascii="Times New Roman" w:hAnsi="Times New Roman" w:cs="Times New Roman"/>
+          <w:lang w:eastAsia="en-US"/>
+        </w:rPr>
+        <w:t>.</w:t>
+      </w:r>
+    </w:p>
+    <w:p>
+      <w:pPr>
+        <w:pStyle w:val="ListParagraph"/>
+        <w:numPr>
+          <w:ilvl w:val="0"/>
+          <w:numId w:val="7"/>
+        </w:numPr>
+        <w:rPr>
+          <w:rFonts w:ascii="Times New Roman" w:hAnsi="Times New Roman" w:cs="Times New Roman"/>
+          <w:lang w:eastAsia="en-US"/>
+        </w:rPr>
+      </w:pPr>
+      <w:r>
+        <w:rPr>
+          <w:rFonts w:ascii="Times New Roman" w:hAnsi="Times New Roman" w:cs="Times New Roman"/>
+          <w:lang w:eastAsia="en-US"/>
+        </w:rPr>
+        <w:t xml:space="preserve">S_PARITY: opcional, calcula la paridad y actualiza </w:t>
+      </w:r>
+      <w:proofErr w:type="spellStart"/>
+      <w:r>
+        <w:rPr>
+          <w:rFonts w:ascii="Times New Roman" w:hAnsi="Times New Roman" w:cs="Times New Roman"/>
+          <w:lang w:eastAsia="en-US"/>
+        </w:rPr>
+        <w:t>parity_error</w:t>
+      </w:r>
+      <w:proofErr w:type="spellEnd"/>
+      <w:r>
+        <w:rPr>
+          <w:rFonts w:ascii="Times New Roman" w:hAnsi="Times New Roman" w:cs="Times New Roman"/>
+          <w:lang w:eastAsia="en-US"/>
+        </w:rPr>
+        <w:t>.</w:t>
+      </w:r>
+    </w:p>
+    <w:p>
+      <w:pPr>
+        <w:pStyle w:val="ListParagraph"/>
+        <w:numPr>
+          <w:ilvl w:val="0"/>
+          <w:numId w:val="7"/>
+        </w:numPr>
+        <w:rPr>
+          <w:rFonts w:ascii="Times New Roman" w:hAnsi="Times New Roman" w:cs="Times New Roman"/>
+          <w:lang w:eastAsia="en-US"/>
+        </w:rPr>
+      </w:pPr>
+      <w:r>
+        <w:rPr>
+          <w:rFonts w:ascii="Times New Roman" w:hAnsi="Times New Roman" w:cs="Times New Roman"/>
+          <w:lang w:eastAsia="en-US"/>
+        </w:rPr>
+        <w:t xml:space="preserve">S_STOP: espera el bit de stop (ignorado en este diseño) y transfiere el contenido del registro SIPO a </w:t>
+      </w:r>
+      <w:proofErr w:type="spellStart"/>
+      <w:r>
+        <w:rPr>
+          <w:rFonts w:ascii="Times New Roman" w:hAnsi="Times New Roman" w:cs="Times New Roman"/>
+          <w:lang w:eastAsia="en-US"/>
+        </w:rPr>
+        <w:t>rx_data</w:t>
+      </w:r>
+      <w:proofErr w:type="spellEnd"/>
+      <w:r>
+        <w:rPr>
+          <w:rFonts w:ascii="Times New Roman" w:hAnsi="Times New Roman" w:cs="Times New Roman"/>
+          <w:lang w:eastAsia="en-US"/>
+        </w:rPr>
+        <w:t>.</w:t>
+      </w:r>
+    </w:p>
+    <w:p>
+      <w:pPr>
+        <w:pStyle w:val="ListParagraph"/>
+        <w:numPr>
+          <w:ilvl w:val="0"/>
+          <w:numId w:val="7"/>
+        </w:numPr>
+        <w:rPr>
+          <w:rFonts w:ascii="Times New Roman" w:hAnsi="Times New Roman" w:cs="Times New Roman"/>
+          <w:lang w:eastAsia="en-US"/>
+        </w:rPr>
+      </w:pPr>
+      <w:r>
+        <w:rPr>
+          <w:rFonts w:ascii="Times New Roman" w:hAnsi="Times New Roman" w:cs="Times New Roman"/>
+          <w:lang w:eastAsia="en-US"/>
+        </w:rPr>
+        <w:t xml:space="preserve">S_CLEANUP: activa </w:t>
+      </w:r>
+      <w:proofErr w:type="spellStart"/>
+      <w:r>
+        <w:rPr>
+          <w:rFonts w:ascii="Times New Roman" w:hAnsi="Times New Roman" w:cs="Times New Roman"/>
+          <w:lang w:eastAsia="en-US"/>
+        </w:rPr>
+        <w:t>received</w:t>
+      </w:r>
+      <w:proofErr w:type="spellEnd"/>
+      <w:r>
+        <w:rPr>
+          <w:rFonts w:ascii="Times New Roman" w:hAnsi="Times New Roman" w:cs="Times New Roman"/>
+          <w:lang w:eastAsia="en-US"/>
+        </w:rPr>
+        <w:t xml:space="preserve"> durante un ciclo y regresa a S_IDLE.</w:t>
+      </w:r>
+    </w:p>
+    <w:p>
+      <w:pPr>
+        <w:rPr>
+          <w:sz w:val="22"/>
+          <w:szCs w:val="22"/>
+          <w:lang w:eastAsia="en-US"/>
+        </w:rPr>
+      </w:pPr>
+    </w:p>
+    <w:p>
+      <w:pPr>
+        <w:rPr>
+          <w:sz w:val="22"/>
+          <w:szCs w:val="22"/>
+          <w:lang w:eastAsia="en-US"/>
+        </w:rPr>
+      </w:pPr>
+    </w:p>
+    <w:p>
+      <w:pPr>
+        <w:rPr>
+          <w:sz w:val="22"/>
+          <w:szCs w:val="22"/>
+          <w:lang w:eastAsia="en-US"/>
+        </w:rPr>
+      </w:pPr>
+    </w:p>
+    <w:p>
+      <w:pPr>
+        <w:rPr>
+          <w:sz w:val="22"/>
+          <w:szCs w:val="22"/>
+          <w:lang w:eastAsia="en-US"/>
+        </w:rPr>
+      </w:pPr>
+    </w:p>
+    <w:p>
+      <w:pPr>
+        <w:rPr>
+          <w:sz w:val="22"/>
+          <w:szCs w:val="22"/>
+          <w:lang w:eastAsia="en-US"/>
+        </w:rPr>
+      </w:pPr>
+    </w:p>
+    <w:p>
+      <w:pPr>
+        <w:rPr>
+          <w:sz w:val="22"/>
+          <w:szCs w:val="22"/>
+          <w:lang w:eastAsia="en-US"/>
+        </w:rPr>
+      </w:pPr>
+    </w:p>
+    <w:p>
+      <w:pPr>
+        <w:rPr>
+          <w:sz w:val="22"/>
+          <w:szCs w:val="22"/>
+          <w:lang w:eastAsia="en-US"/>
+        </w:rPr>
+      </w:pPr>
+    </w:p>
+    <w:p>
+      <w:pPr>
+        <w:jc w:val="center"/>
+        <w:rPr>
+          <w:sz w:val="22"/>
+          <w:szCs w:val="22"/>
+          <w:lang w:eastAsia="en-US"/>
+        </w:rPr>
+      </w:pPr>
+      <w:r>
+        <w:rPr>
+          <w:sz w:val="22"/>
+          <w:szCs w:val="22"/>
+          <w:lang w:eastAsia="en-US"/>
+        </w:rPr>
+        <w:lastRenderedPageBreak/>
+        <w:t xml:space="preserve">Diagrama de arquitectura de la UART en caso de </w:t>
+      </w:r>
+      <w:proofErr w:type="spellStart"/>
+      <w:r>
+        <w:rPr>
+          <w:sz w:val="22"/>
+          <w:szCs w:val="22"/>
+          <w:lang w:eastAsia="en-US"/>
+        </w:rPr>
+        <w:t>rx</w:t>
+      </w:r>
+      <w:proofErr w:type="spellEnd"/>
+    </w:p>
+    <w:p>
+      <w:pPr>
+        <w:rPr>
+          <w:sz w:val="20"/>
+          <w:szCs w:val="20"/>
+          <w:lang w:eastAsia="en-US"/>
+        </w:rPr>
+      </w:pPr>
+      <w:r>
+        <w:rPr>
+          <w:noProof/>
+          <w:sz w:val="20"/>
+          <w:szCs w:val="20"/>
+          <w:lang w:eastAsia="en-US"/>
+        </w:rPr>
+        <mc:AlternateContent>
+          <mc:Choice Requires="wps">
+            <w:drawing>
+              <wp:anchor distT="0" distB="0" distL="114300" distR="114300" simplePos="0" relativeHeight="251660288" behindDoc="0" locked="0" layoutInCell="1" allowOverlap="1" wp14:anchorId="1D8EDD70" wp14:editId="1FB48AC2">
+                <wp:simplePos x="0" y="0"/>
+                <wp:positionH relativeFrom="column">
+                  <wp:posOffset>4267117</wp:posOffset>
+                </wp:positionH>
+                <wp:positionV relativeFrom="paragraph">
+                  <wp:posOffset>363966</wp:posOffset>
+                </wp:positionV>
+                <wp:extent cx="2282024" cy="4579952"/>
+                <wp:effectExtent l="0" t="0" r="23495" b="11430"/>
+                <wp:wrapNone/>
+                <wp:docPr id="1459519418" name="Text Box 7"/>
+                <wp:cNvGraphicFramePr/>
+                <a:graphic xmlns:a="http://schemas.openxmlformats.org/drawingml/2006/main">
+                  <a:graphicData uri="http://schemas.microsoft.com/office/word/2010/wordprocessingShape">
+                    <wps:wsp>
+                      <wps:cNvSpPr txBox="1"/>
+                      <wps:spPr>
+                        <a:xfrm>
+                          <a:off x="0" y="0"/>
+                          <a:ext cx="2282024" cy="4579952"/>
+                        </a:xfrm>
+                        <a:prstGeom prst="rect">
+                          <a:avLst/>
+                        </a:prstGeom>
+                        <a:solidFill>
+                          <a:schemeClr val="lt1"/>
+                        </a:solidFill>
+                        <a:ln w="6350">
+                          <a:solidFill>
+                            <a:prstClr val="black"/>
+                          </a:solidFill>
+                        </a:ln>
+                      </wps:spPr>
+                      <wps:txbx>
+                        <w:txbxContent>
+                          <w:p>
+                            <w:pPr>
+                              <w:jc w:val="both"/>
+                            </w:pPr>
+                            <w:r>
+                              <w:t xml:space="preserve">Este diagrama muestra cómo se organiza el módulo </w:t>
+                            </w:r>
+                            <w:proofErr w:type="spellStart"/>
+                            <w:r>
+                              <w:t>uart_rx</w:t>
+                            </w:r>
+                            <w:proofErr w:type="spellEnd"/>
+                            <w:r>
+                              <w:t xml:space="preserve"> en tres bloques principales. Primero, el sincronizador de dos </w:t>
+                            </w:r>
+                            <w:proofErr w:type="spellStart"/>
+                            <w:r>
+                              <w:t>flip-flops</w:t>
+                            </w:r>
+                            <w:proofErr w:type="spellEnd"/>
+                            <w:r>
+                              <w:t xml:space="preserve"> limpia la señal serial </w:t>
+                            </w:r>
+                            <w:proofErr w:type="spellStart"/>
+                            <w:r>
+                              <w:t>rx</w:t>
+                            </w:r>
+                            <w:proofErr w:type="spellEnd"/>
+                            <w:r>
+                              <w:t xml:space="preserve"> para evitar problemas de </w:t>
+                            </w:r>
+                            <w:proofErr w:type="spellStart"/>
+                            <w:r>
+                              <w:t>metaestabilidad</w:t>
+                            </w:r>
+                            <w:proofErr w:type="spellEnd"/>
+                            <w:r>
+                              <w:t xml:space="preserve"> y entrega una versión estable llamada </w:t>
+                            </w:r>
+                            <w:proofErr w:type="spellStart"/>
+                            <w:r>
+                              <w:t>rx_bit</w:t>
+                            </w:r>
+                            <w:proofErr w:type="spellEnd"/>
+                            <w:r>
+                              <w:t>. Luego, la máquina de estados (FSM) controla el proceso de recepción: cuenta ciclos de reloj (</w:t>
+                            </w:r>
+                            <w:proofErr w:type="spellStart"/>
+                            <w:r>
+                              <w:t>clk_count</w:t>
+                            </w:r>
+                            <w:proofErr w:type="spellEnd"/>
+                            <w:r>
+                              <w:t>), identifica qué bit se está recibiendo (</w:t>
+                            </w:r>
+                            <w:proofErr w:type="spellStart"/>
+                            <w:r>
+                              <w:t>bit_index</w:t>
+                            </w:r>
+                            <w:proofErr w:type="spellEnd"/>
+                            <w:r>
+                              <w:t>) y decide cuándo desplazar datos hacia el registro. Finalmente, el registro SIPO convierte los bits seriales en un byte paralelo (</w:t>
+                            </w:r>
+                            <w:proofErr w:type="spellStart"/>
+                            <w:r>
+                              <w:t>rx_data</w:t>
+                            </w:r>
+                            <w:proofErr w:type="spellEnd"/>
+                            <w:r>
+                              <w:t xml:space="preserve">). La FSM también genera las señales de salida </w:t>
+                            </w:r>
+                            <w:proofErr w:type="spellStart"/>
+                            <w:r>
+                              <w:t>received</w:t>
+                            </w:r>
+                            <w:proofErr w:type="spellEnd"/>
+                            <w:r>
+                              <w:t xml:space="preserve"> (pulso de un ciclo) y </w:t>
+                            </w:r>
+                            <w:proofErr w:type="spellStart"/>
+                            <w:r>
+                              <w:t>parity_error</w:t>
+                            </w:r>
+                            <w:proofErr w:type="spellEnd"/>
+                            <w:r>
+                              <w:t>.</w:t>
+                            </w:r>
+                          </w:p>
+                        </w:txbxContent>
+                      </wps:txbx>
+                      <wps:bodyPr rot="0" spcFirstLastPara="0" vertOverflow="overflow" horzOverflow="overflow" vert="horz" wrap="square" lIns="91440" tIns="45720" rIns="91440" bIns="45720" numCol="1" spcCol="0" rtlCol="0" fromWordArt="0" anchor="t" anchorCtr="0" forceAA="0" compatLnSpc="1">
+                        <a:prstTxWarp prst="textNoShape">
+                          <a:avLst/>
+                        </a:prstTxWarp>
+                        <a:noAutofit/>
+                      </wps:bodyPr>
+                    </wps:wsp>
+                  </a:graphicData>
+                </a:graphic>
+              </wp:anchor>
+            </w:drawing>
+          </mc:Choice>
+          <mc:Fallback>
+            <w:pict>
+              <v:shapetype w14:anchorId="1D8EDD70" id="_x0000_t202" coordsize="21600,21600" o:spt="202" path="m,l,21600r21600,l21600,xe">
+                <v:stroke joinstyle="miter"/>
+                <v:path gradientshapeok="t" o:connecttype="rect"/>
+              </v:shapetype>
+              <v:shape id="Text Box 7" o:spid="_x0000_s1026" type="#_x0000_t202" style="position:absolute;margin-left:336pt;margin-top:28.65pt;width:179.7pt;height:360.65pt;z-index:251660288;visibility:visible;mso-wrap-style:square;mso-wrap-distance-left:9pt;mso-wrap-distance-top:0;mso-wrap-distance-right:9pt;mso-wrap-distance-bottom:0;mso-position-horizontal:absolute;mso-position-horizontal-relative:text;mso-position-vertical:absolute;mso-position-vertical-relative:text;v-text-anchor:top" o:gfxdata="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" fillcolor="white [3201]" strokeweight=".5pt">
+                <v:textbox>
+                  <w:txbxContent>
+                    <w:p>
+                      <w:pPr>
+                        <w:jc w:val="both"/>
+                      </w:pPr>
+                      <w:r>
+                        <w:t xml:space="preserve">Este diagrama muestra cómo se organiza el módulo </w:t>
+                      </w:r>
+                      <w:proofErr w:type="spellStart"/>
+                      <w:r>
+                        <w:t>uart_rx</w:t>
+                      </w:r>
+                      <w:proofErr w:type="spellEnd"/>
+                      <w:r>
+                        <w:t xml:space="preserve"> en tres bloques principales. Primero, el sincronizador de dos </w:t>
+                      </w:r>
+                      <w:proofErr w:type="spellStart"/>
+                      <w:r>
+                        <w:t>flip-flops</w:t>
+                      </w:r>
+                      <w:proofErr w:type="spellEnd"/>
+                      <w:r>
+                        <w:t xml:space="preserve"> limpia la señal serial </w:t>
+                      </w:r>
+                      <w:proofErr w:type="spellStart"/>
+                      <w:r>
+                        <w:t>rx</w:t>
+                      </w:r>
+                      <w:proofErr w:type="spellEnd"/>
+                      <w:r>
+                        <w:t xml:space="preserve"> para evitar problemas de </w:t>
+                      </w:r>
+                      <w:proofErr w:type="spellStart"/>
+                      <w:r>
+                        <w:t>metaestabilidad</w:t>
+                      </w:r>
+                      <w:proofErr w:type="spellEnd"/>
+                      <w:r>
+                        <w:t xml:space="preserve"> y entrega una versión estable llamada </w:t>
+                      </w:r>
+                      <w:proofErr w:type="spellStart"/>
+                      <w:r>
+                        <w:t>rx_bit</w:t>
+                      </w:r>
+                      <w:proofErr w:type="spellEnd"/>
+                      <w:r>
+                        <w:t>. Luego, la máquina de estados (FSM) controla el proceso de recepción: cuenta ciclos de reloj (</w:t>
+                      </w:r>
+                      <w:proofErr w:type="spellStart"/>
+                      <w:r>
+                        <w:t>clk_count</w:t>
+                      </w:r>
+                      <w:proofErr w:type="spellEnd"/>
+                      <w:r>
+                        <w:t>), identifica qué bit se está recibiendo (</w:t>
+                      </w:r>
+                      <w:proofErr w:type="spellStart"/>
+                      <w:r>
+                        <w:t>bit_index</w:t>
+                      </w:r>
+                      <w:proofErr w:type="spellEnd"/>
+                      <w:r>
+                        <w:t>) y decide cuándo desplazar datos hacia el registro. Finalmente, el registro SIPO convierte los bits seriales en un byte paralelo (</w:t>
+                      </w:r>
+                      <w:proofErr w:type="spellStart"/>
+                      <w:r>
+                        <w:t>rx_data</w:t>
+                      </w:r>
+                      <w:proofErr w:type="spellEnd"/>
+                      <w:r>
+                        <w:t xml:space="preserve">). La FSM también genera las señales de salida </w:t>
+                      </w:r>
+                      <w:proofErr w:type="spellStart"/>
+                      <w:r>
+                        <w:t>received</w:t>
+                      </w:r>
+                      <w:proofErr w:type="spellEnd"/>
+                      <w:r>
+                        <w:t xml:space="preserve"> (pulso de un ciclo) y </w:t>
+                      </w:r>
+                      <w:proofErr w:type="spellStart"/>
+                      <w:r>
+                        <w:t>parity_error</w:t>
+                      </w:r>
+                      <w:proofErr w:type="spellEnd"/>
+                      <w:r>
+                        <w:t>.</w:t>
+                      </w:r>
+                    </w:p>
+                  </w:txbxContent>
+                </v:textbox>
+              </v:shape>
+            </w:pict>
+          </mc:Fallback>
+        </mc:AlternateContent>
+      </w:r>
+      <w:r>
+        <w:rPr>
+          <w:noProof/>
+          <w:sz w:val="20"/>
+          <w:szCs w:val="20"/>
+          <w:lang w:eastAsia="en-US"/>
+        </w:rPr>
+        <w:drawing>
+          <wp:inline distT="0" distB="0" distL="0" distR="0" wp14:anchorId="251B35F8" wp14:editId="495A4D2C">
+            <wp:extent cx="4054415" cy="7277528"/>
+            <wp:effectExtent l="0" t="0" r="3810" b="0"/>
+            <wp:docPr id="1225011770" name="Picture 4"/>
+            <wp:cNvGraphicFramePr>
+              <a:graphicFrameLocks xmlns:a="http://schemas.openxmlformats.org/drawingml/2006/main" noChangeAspect="1"/>
+            </wp:cNvGraphicFramePr>
+            <a:graphic xmlns:a="http://schemas.openxmlformats.org/drawingml/2006/main">
+              <a:graphicData uri="http://schemas.openxmlformats.org/drawingml/2006/picture">
+                <pic:pic xmlns:pic="http://schemas.openxmlformats.org/drawingml/2006/picture">
+                  <pic:nvPicPr>
+                    <pic:cNvPr id="0" name="Picture 1"/>
+                    <pic:cNvPicPr>
+                      <a:picLocks noChangeAspect="1" noChangeArrowheads="1"/>
+                    </pic:cNvPicPr>
+                  </pic:nvPicPr>
+                  <pic:blipFill>
+                    <a:blip r:embed="rId15" cstate="print">
+                      <a:extLst>
+                        <a:ext uri="{28A0092B-C50C-407E-A947-70E740481C1C}">
+                          <a14:useLocalDpi xmlns:a14="http://schemas.microsoft.com/office/drawing/2010/main" val="0"/>
+                        </a:ext>
+                      </a:extLst>
+                    </a:blip>
+                    <a:srcRect/>
+                    <a:stretch>
+                      <a:fillRect/>
+                    </a:stretch>
+                  </pic:blipFill>
+                  <pic:spPr bwMode="auto">
+                    <a:xfrm>
+                      <a:off x="0" y="0"/>
+                      <a:ext cx="4062439" cy="7291931"/>
+                    </a:xfrm>
+                    <a:prstGeom prst="rect">
+                      <a:avLst/>
+                    </a:prstGeom>
+                    <a:noFill/>
+                    <a:ln>
+                      <a:noFill/>
+                    </a:ln>
+                  </pic:spPr>
+                </pic:pic>
+              </a:graphicData>
+            </a:graphic>
+          </wp:inline>
+        </w:drawing>
+      </w:r>
+    </w:p>
+    <w:p>
+      <w:pPr>
+        <w:jc w:val="both"/>
+        <w:rPr>
+          <w:sz w:val="20"/>
+          <w:szCs w:val="20"/>
+          <w:lang w:eastAsia="en-US"/>
+        </w:rPr>
+      </w:pPr>
+    </w:p>
+    <w:p>
+      <w:pPr>
+        <w:jc w:val="both"/>
+        <w:rPr>
+          <w:sz w:val="20"/>
+          <w:szCs w:val="20"/>
+          <w:lang w:eastAsia="en-US"/>
+        </w:rPr>
+      </w:pPr>
+    </w:p>
+    <w:p>
+      <w:pPr>
+        <w:jc w:val="both"/>
+        <w:rPr>
+          <w:sz w:val="20"/>
+          <w:szCs w:val="20"/>
+          <w:lang w:eastAsia="en-US"/>
+        </w:rPr>
+      </w:pPr>
+    </w:p>
+    <w:p>
+      <w:pPr>
+        <w:jc w:val="both"/>
+        <w:rPr>
+          <w:sz w:val="20"/>
+          <w:szCs w:val="20"/>
+          <w:lang w:eastAsia="en-US"/>
+        </w:rPr>
+      </w:pPr>
+    </w:p>
+    <w:p>
+      <w:pPr>
+        <w:jc w:val="both"/>
+        <w:rPr>
+          <w:sz w:val="20"/>
+          <w:szCs w:val="20"/>
+          <w:lang w:eastAsia="en-US"/>
+        </w:rPr>
+      </w:pPr>
+    </w:p>
+    <w:p>
+      <w:pPr>
+        <w:jc w:val="both"/>
+        <w:rPr>
+          <w:sz w:val="20"/>
+          <w:szCs w:val="20"/>
+          <w:lang w:eastAsia="en-US"/>
+        </w:rPr>
+      </w:pPr>
+    </w:p>
+    <w:p>
+      <w:pPr>
+        <w:jc w:val="both"/>
+        <w:rPr>
+          <w:sz w:val="20"/>
+          <w:szCs w:val="20"/>
+          <w:lang w:eastAsia="en-US"/>
+        </w:rPr>
+      </w:pPr>
+    </w:p>
+    <w:p>
+      <w:pPr>
+        <w:jc w:val="both"/>
+        <w:rPr>
+          <w:sz w:val="20"/>
+          <w:szCs w:val="20"/>
+          <w:lang w:eastAsia="en-US"/>
+        </w:rPr>
+      </w:pPr>
+      <w:proofErr w:type="spellStart"/>
+      <w:r>
+        <w:rPr>
+          <w:sz w:val="20"/>
+          <w:szCs w:val="20"/>
+          <w:lang w:eastAsia="en-US"/>
+        </w:rPr>
+        <w:lastRenderedPageBreak/>
         <w:t>Transmission</w:t>
       </w:r>
-      <w:r>
-        <w:rPr>
-          <w:rFonts w:ascii="Arial" w:hAnsi="Arial" w:cs="Arial"/>
-          <w:sz w:val="20"/>
-          <w:szCs w:val="20"/>
-          <w:lang w:val="en-US" w:eastAsia="en-US"/>
+      <w:proofErr w:type="spellEnd"/>
+      <w:r>
+        <w:rPr>
+          <w:sz w:val="20"/>
+          <w:szCs w:val="20"/>
+          <w:lang w:eastAsia="en-US"/>
         </w:rPr>
         <w:t>:</w:t>
       </w:r>
@@ -1244,11 +2515,13 @@
         </w:numPr>
         <w:jc w:val="both"/>
         <w:rPr>
-          <w:lang w:val="en-US"/>
-        </w:rPr>
-      </w:pPr>
-      <w:r>
-        <w:rPr>
+          <w:rFonts w:ascii="Times New Roman" w:hAnsi="Times New Roman" w:cs="Times New Roman"/>
+          <w:lang w:val="en-US"/>
+        </w:rPr>
+      </w:pPr>
+      <w:r>
+        <w:rPr>
+          <w:rFonts w:ascii="Times New Roman" w:hAnsi="Times New Roman" w:cs="Times New Roman"/>
           <w:lang w:val="en-US"/>
         </w:rPr>
         <w:t>Parallel data input (8-bit data input)</w:t>
@@ -1263,23 +2536,27 @@
         </w:numPr>
         <w:jc w:val="both"/>
         <w:rPr>
-          <w:lang w:val="en-US"/>
-        </w:rPr>
-      </w:pPr>
-      <w:r>
-        <w:rPr>
+          <w:rFonts w:ascii="Times New Roman" w:hAnsi="Times New Roman" w:cs="Times New Roman"/>
+          <w:lang w:val="en-US"/>
+        </w:rPr>
+      </w:pPr>
+      <w:r>
+        <w:rPr>
+          <w:rFonts w:ascii="Times New Roman" w:hAnsi="Times New Roman" w:cs="Times New Roman"/>
           <w:lang w:val="en-US"/>
         </w:rPr>
         <w:t>Send bit (</w:t>
       </w:r>
       <w:r>
         <w:rPr>
+          <w:rFonts w:ascii="Times New Roman" w:hAnsi="Times New Roman" w:cs="Times New Roman"/>
           <w:lang w:val="en-US"/>
         </w:rPr>
         <w:t>a single clock cycle must be enough to start transmission</w:t>
       </w:r>
       <w:r>
         <w:rPr>
+          <w:rFonts w:ascii="Times New Roman" w:hAnsi="Times New Roman" w:cs="Times New Roman"/>
           <w:lang w:val="en-US"/>
         </w:rPr>
         <w:t>)</w:t>
@@ -1294,11 +2571,13 @@
         </w:numPr>
         <w:jc w:val="both"/>
         <w:rPr>
-          <w:lang w:val="en-US"/>
-        </w:rPr>
-      </w:pPr>
-      <w:r>
-        <w:rPr>
+          <w:rFonts w:ascii="Times New Roman" w:hAnsi="Times New Roman" w:cs="Times New Roman"/>
+          <w:lang w:val="en-US"/>
+        </w:rPr>
+      </w:pPr>
+      <w:r>
+        <w:rPr>
+          <w:rFonts w:ascii="Times New Roman" w:hAnsi="Times New Roman" w:cs="Times New Roman"/>
           <w:lang w:val="en-US"/>
         </w:rPr>
         <w:t>Architecture must include a PISO register.</w:t>
@@ -1313,42 +2592,48 @@
         </w:numPr>
         <w:jc w:val="both"/>
         <w:rPr>
-          <w:lang w:val="en-US"/>
-        </w:rPr>
-      </w:pPr>
-      <w:r>
-        <w:rPr>
+          <w:rFonts w:ascii="Times New Roman" w:hAnsi="Times New Roman" w:cs="Times New Roman"/>
+          <w:lang w:val="en-US"/>
+        </w:rPr>
+      </w:pPr>
+      <w:r>
+        <w:rPr>
+          <w:rFonts w:ascii="Times New Roman" w:hAnsi="Times New Roman" w:cs="Times New Roman"/>
           <w:lang w:val="en-US"/>
         </w:rPr>
         <w:t>Baud</w:t>
       </w:r>
       <w:r>
         <w:rPr>
+          <w:rFonts w:ascii="Times New Roman" w:hAnsi="Times New Roman" w:cs="Times New Roman"/>
           <w:lang w:val="en-US"/>
         </w:rPr>
         <w:t>-ra</w:t>
       </w:r>
       <w:r>
         <w:rPr>
+          <w:rFonts w:ascii="Times New Roman" w:hAnsi="Times New Roman" w:cs="Times New Roman"/>
           <w:lang w:val="en-US"/>
         </w:rPr>
         <w:t xml:space="preserve">te </w:t>
       </w:r>
       <w:r>
         <w:rPr>
+          <w:rFonts w:ascii="Times New Roman" w:hAnsi="Times New Roman" w:cs="Times New Roman"/>
           <w:lang w:val="en-US"/>
         </w:rPr>
         <w:t>must take 5 clock cycle per bit</w:t>
       </w:r>
       <w:r>
         <w:rPr>
+          <w:rFonts w:ascii="Times New Roman" w:hAnsi="Times New Roman" w:cs="Times New Roman"/>
           <w:lang w:val="en-US"/>
         </w:rPr>
         <w:t xml:space="preserve"> </w:t>
       </w:r>
       <w:r>
         <w:rPr>
-          <w:rFonts w:ascii="Arial" w:hAnsi="Arial" w:cs="Arial"/>
+          <w:rFonts w:ascii="Times New Roman" w:hAnsi="Times New Roman" w:cs="Times New Roman"/>
           <w:sz w:val="20"/>
           <w:szCs w:val="20"/>
           <w:lang w:val="en-US" w:eastAsia="en-US"/>
@@ -1357,7 +2642,7 @@
       </w:r>
       <w:r>
         <w:rPr>
-          <w:rFonts w:ascii="Arial" w:hAnsi="Arial" w:cs="Arial"/>
+          <w:rFonts w:ascii="Times New Roman" w:hAnsi="Times New Roman" w:cs="Times New Roman"/>
           <w:sz w:val="20"/>
           <w:szCs w:val="20"/>
           <w:lang w:val="en-US" w:eastAsia="en-US"/>
@@ -1366,7 +2651,7 @@
       </w:r>
       <w:r>
         <w:rPr>
-          <w:rFonts w:ascii="Arial" w:hAnsi="Arial" w:cs="Arial"/>
+          <w:rFonts w:ascii="Times New Roman" w:hAnsi="Times New Roman" w:cs="Times New Roman"/>
           <w:sz w:val="20"/>
           <w:szCs w:val="20"/>
           <w:lang w:val="en-US" w:eastAsia="en-US"/>
@@ -1375,7 +2660,7 @@
       </w:r>
       <w:r>
         <w:rPr>
-          <w:rFonts w:ascii="Arial" w:hAnsi="Arial" w:cs="Arial"/>
+          <w:rFonts w:ascii="Times New Roman" w:hAnsi="Times New Roman" w:cs="Times New Roman"/>
           <w:sz w:val="20"/>
           <w:szCs w:val="20"/>
           <w:lang w:val="en-US" w:eastAsia="en-US"/>
@@ -1384,7 +2669,7 @@
       </w:r>
       <w:r>
         <w:rPr>
-          <w:rFonts w:ascii="Arial" w:hAnsi="Arial" w:cs="Arial"/>
+          <w:rFonts w:ascii="Times New Roman" w:hAnsi="Times New Roman" w:cs="Times New Roman"/>
           <w:sz w:val="20"/>
           <w:szCs w:val="20"/>
           <w:lang w:val="en-US" w:eastAsia="en-US"/>
@@ -1401,17 +2686,20 @@
         </w:numPr>
         <w:jc w:val="both"/>
         <w:rPr>
-          <w:lang w:val="en-US"/>
-        </w:rPr>
-      </w:pPr>
-      <w:r>
-        <w:rPr>
+          <w:rFonts w:ascii="Times New Roman" w:hAnsi="Times New Roman" w:cs="Times New Roman"/>
+          <w:lang w:val="en-US"/>
+        </w:rPr>
+      </w:pPr>
+      <w:r>
+        <w:rPr>
+          <w:rFonts w:ascii="Times New Roman" w:hAnsi="Times New Roman" w:cs="Times New Roman"/>
           <w:lang w:val="en-US"/>
         </w:rPr>
         <w:t xml:space="preserve">Stop Bit </w:t>
       </w:r>
       <w:r>
         <w:rPr>
+          <w:rFonts w:ascii="Times New Roman" w:hAnsi="Times New Roman" w:cs="Times New Roman"/>
           <w:lang w:val="en-US"/>
         </w:rPr>
         <w:t>fixed to 2 bits.</w:t>
@@ -1426,41 +2714,48 @@
         </w:numPr>
         <w:jc w:val="both"/>
         <w:rPr>
-          <w:lang w:val="en-US"/>
-        </w:rPr>
-      </w:pPr>
-      <w:r>
-        <w:rPr>
+          <w:rFonts w:ascii="Times New Roman" w:hAnsi="Times New Roman" w:cs="Times New Roman"/>
+          <w:lang w:val="en-US"/>
+        </w:rPr>
+      </w:pPr>
+      <w:r>
+        <w:rPr>
+          <w:rFonts w:ascii="Times New Roman" w:hAnsi="Times New Roman" w:cs="Times New Roman"/>
           <w:lang w:val="en-US"/>
         </w:rPr>
         <w:t xml:space="preserve">Parity Bit </w:t>
       </w:r>
       <w:r>
         <w:rPr>
+          <w:rFonts w:ascii="Times New Roman" w:hAnsi="Times New Roman" w:cs="Times New Roman"/>
           <w:lang w:val="en-US"/>
         </w:rPr>
         <w:t>None</w:t>
       </w:r>
       <w:r>
         <w:rPr>
+          <w:rFonts w:ascii="Times New Roman" w:hAnsi="Times New Roman" w:cs="Times New Roman"/>
           <w:lang w:val="en-US"/>
         </w:rPr>
         <w:t>. 10</w:t>
       </w:r>
       <w:r>
         <w:rPr>
+          <w:rFonts w:ascii="Times New Roman" w:hAnsi="Times New Roman" w:cs="Times New Roman"/>
           <w:lang w:val="en-US"/>
         </w:rPr>
         <w:t>%</w:t>
       </w:r>
       <w:r>
         <w:rPr>
+          <w:rFonts w:ascii="Times New Roman" w:hAnsi="Times New Roman" w:cs="Times New Roman"/>
           <w:lang w:val="en-US"/>
         </w:rPr>
         <w:t xml:space="preserve"> extra if it is parametrized </w:t>
       </w:r>
       <w:r>
         <w:rPr>
+          <w:rFonts w:ascii="Times New Roman" w:hAnsi="Times New Roman" w:cs="Times New Roman"/>
           <w:lang w:val="en-US"/>
         </w:rPr>
         <w:t>(odd, even, none).</w:t>
@@ -1475,29 +2770,34 @@
         </w:numPr>
         <w:jc w:val="both"/>
         <w:rPr>
-          <w:lang w:val="en-US"/>
-        </w:rPr>
-      </w:pPr>
-      <w:r>
-        <w:rPr>
+          <w:rFonts w:ascii="Times New Roman" w:hAnsi="Times New Roman" w:cs="Times New Roman"/>
+          <w:lang w:val="en-US"/>
+        </w:rPr>
+      </w:pPr>
+      <w:r>
+        <w:rPr>
+          <w:rFonts w:ascii="Times New Roman" w:hAnsi="Times New Roman" w:cs="Times New Roman"/>
           <w:lang w:val="en-US"/>
         </w:rPr>
         <w:t>Tx output</w:t>
       </w:r>
       <w:r>
         <w:rPr>
+          <w:rFonts w:ascii="Times New Roman" w:hAnsi="Times New Roman" w:cs="Times New Roman"/>
           <w:lang w:val="en-US"/>
         </w:rPr>
         <w:t xml:space="preserve"> </w:t>
       </w:r>
       <w:r>
         <w:rPr>
+          <w:rFonts w:ascii="Times New Roman" w:hAnsi="Times New Roman" w:cs="Times New Roman"/>
           <w:lang w:val="en-US"/>
         </w:rPr>
         <w:t>of</w:t>
       </w:r>
       <w:r>
         <w:rPr>
+          <w:rFonts w:ascii="Times New Roman" w:hAnsi="Times New Roman" w:cs="Times New Roman"/>
           <w:lang w:val="en-US"/>
         </w:rPr>
         <w:t xml:space="preserve"> 1 bit.</w:t>
@@ -1512,47 +2812,55 @@
         </w:numPr>
         <w:jc w:val="both"/>
         <w:rPr>
-          <w:lang w:val="en-US"/>
-        </w:rPr>
-      </w:pPr>
-      <w:r>
-        <w:rPr>
+          <w:rFonts w:ascii="Times New Roman" w:hAnsi="Times New Roman" w:cs="Times New Roman"/>
+          <w:lang w:val="en-US"/>
+        </w:rPr>
+      </w:pPr>
+      <w:r>
+        <w:rPr>
+          <w:rFonts w:ascii="Times New Roman" w:hAnsi="Times New Roman" w:cs="Times New Roman"/>
           <w:lang w:val="en-US"/>
         </w:rPr>
         <w:t xml:space="preserve">Ready output </w:t>
       </w:r>
       <w:r>
         <w:rPr>
+          <w:rFonts w:ascii="Times New Roman" w:hAnsi="Times New Roman" w:cs="Times New Roman"/>
           <w:lang w:val="en-US"/>
         </w:rPr>
         <w:t xml:space="preserve">is set </w:t>
       </w:r>
       <w:r>
         <w:rPr>
+          <w:rFonts w:ascii="Times New Roman" w:hAnsi="Times New Roman" w:cs="Times New Roman"/>
           <w:lang w:val="en-US"/>
         </w:rPr>
         <w:t xml:space="preserve">when UART is not </w:t>
       </w:r>
       <w:r>
         <w:rPr>
+          <w:rFonts w:ascii="Times New Roman" w:hAnsi="Times New Roman" w:cs="Times New Roman"/>
           <w:lang w:val="en-US"/>
         </w:rPr>
         <w:t xml:space="preserve">being </w:t>
       </w:r>
       <w:r>
         <w:rPr>
+          <w:rFonts w:ascii="Times New Roman" w:hAnsi="Times New Roman" w:cs="Times New Roman"/>
           <w:lang w:val="en-US"/>
         </w:rPr>
         <w:t>transmitt</w:t>
       </w:r>
       <w:r>
         <w:rPr>
+          <w:rFonts w:ascii="Times New Roman" w:hAnsi="Times New Roman" w:cs="Times New Roman"/>
           <w:lang w:val="en-US"/>
         </w:rPr>
         <w:t>ed</w:t>
       </w:r>
       <w:r>
         <w:rPr>
+          <w:rFonts w:ascii="Times New Roman" w:hAnsi="Times New Roman" w:cs="Times New Roman"/>
           <w:lang w:val="en-US"/>
         </w:rPr>
         <w:t xml:space="preserve"> (after </w:t>
@@ -1560,6 +2868,7 @@
       <w:proofErr w:type="gramStart"/>
       <w:r>
         <w:rPr>
+          <w:rFonts w:ascii="Times New Roman" w:hAnsi="Times New Roman" w:cs="Times New Roman"/>
           <w:lang w:val="en-US"/>
         </w:rPr>
         <w:t>reset</w:t>
@@ -1567,12 +2876,14 @@
       <w:proofErr w:type="gramEnd"/>
       <w:r>
         <w:rPr>
+          <w:rFonts w:ascii="Times New Roman" w:hAnsi="Times New Roman" w:cs="Times New Roman"/>
           <w:lang w:val="en-US"/>
         </w:rPr>
         <w:t xml:space="preserve"> it must be 1)</w:t>
       </w:r>
       <w:r>
         <w:rPr>
+          <w:rFonts w:ascii="Times New Roman" w:hAnsi="Times New Roman" w:cs="Times New Roman"/>
           <w:lang w:val="en-US"/>
         </w:rPr>
         <w:t xml:space="preserve">. </w:t>
@@ -1582,15 +2893,13 @@
       <w:pPr>
         <w:jc w:val="both"/>
         <w:rPr>
-          <w:rFonts w:ascii="Arial" w:hAnsi="Arial" w:cs="Arial"/>
-          <w:sz w:val="20"/>
-          <w:szCs w:val="20"/>
-          <w:lang w:val="en-US"/>
-        </w:rPr>
-      </w:pPr>
-      <w:r>
-        <w:rPr>
-          <w:rFonts w:ascii="Arial" w:hAnsi="Arial" w:cs="Arial"/>
+          <w:sz w:val="20"/>
+          <w:szCs w:val="20"/>
+          <w:lang w:val="en-US"/>
+        </w:rPr>
+      </w:pPr>
+      <w:r>
+        <w:rPr>
           <w:sz w:val="20"/>
           <w:szCs w:val="20"/>
           <w:lang w:val="en-US"/>
@@ -1607,15 +2916,15 @@
         </w:numPr>
         <w:jc w:val="both"/>
         <w:rPr>
-          <w:rFonts w:ascii="Arial" w:hAnsi="Arial" w:cs="Arial"/>
-          <w:sz w:val="20"/>
-          <w:szCs w:val="20"/>
-          <w:lang w:val="en-US"/>
-        </w:rPr>
-      </w:pPr>
-      <w:r>
-        <w:rPr>
-          <w:rFonts w:ascii="Arial" w:hAnsi="Arial" w:cs="Arial"/>
+          <w:rFonts w:ascii="Times New Roman" w:hAnsi="Times New Roman" w:cs="Times New Roman"/>
+          <w:sz w:val="20"/>
+          <w:szCs w:val="20"/>
+          <w:lang w:val="en-US"/>
+        </w:rPr>
+      </w:pPr>
+      <w:r>
+        <w:rPr>
+          <w:rFonts w:ascii="Times New Roman" w:hAnsi="Times New Roman" w:cs="Times New Roman"/>
           <w:sz w:val="20"/>
           <w:szCs w:val="20"/>
           <w:lang w:val="en-US"/>
@@ -1624,7 +2933,7 @@
       </w:r>
       <w:r>
         <w:rPr>
-          <w:rFonts w:ascii="Arial" w:hAnsi="Arial" w:cs="Arial"/>
+          <w:rFonts w:ascii="Times New Roman" w:hAnsi="Times New Roman" w:cs="Times New Roman"/>
           <w:sz w:val="20"/>
           <w:szCs w:val="20"/>
           <w:lang w:val="en-US"/>
@@ -1641,15 +2950,15 @@
         </w:numPr>
         <w:jc w:val="both"/>
         <w:rPr>
-          <w:rFonts w:ascii="Arial" w:hAnsi="Arial" w:cs="Arial"/>
-          <w:sz w:val="20"/>
-          <w:szCs w:val="20"/>
-          <w:lang w:val="en-US"/>
-        </w:rPr>
-      </w:pPr>
-      <w:r>
-        <w:rPr>
-          <w:rFonts w:ascii="Arial" w:hAnsi="Arial" w:cs="Arial"/>
+          <w:rFonts w:ascii="Times New Roman" w:hAnsi="Times New Roman" w:cs="Times New Roman"/>
+          <w:sz w:val="20"/>
+          <w:szCs w:val="20"/>
+          <w:lang w:val="en-US"/>
+        </w:rPr>
+      </w:pPr>
+      <w:r>
+        <w:rPr>
+          <w:rFonts w:ascii="Times New Roman" w:hAnsi="Times New Roman" w:cs="Times New Roman"/>
           <w:sz w:val="20"/>
           <w:szCs w:val="20"/>
           <w:lang w:val="en-US"/>
@@ -1666,83 +2975,43 @@
         </w:numPr>
         <w:jc w:val="both"/>
         <w:rPr>
-          <w:lang w:val="en-US"/>
-        </w:rPr>
-      </w:pPr>
-      <w:r>
-        <w:rPr>
-          <w:lang w:val="en-US"/>
-        </w:rPr>
-        <w:t>Baud</w:t>
-      </w:r>
-      <w:r>
-        <w:rPr>
-          <w:lang w:val="en-US"/>
-        </w:rPr>
-        <w:t>-ra</w:t>
-      </w:r>
-      <w:r>
-        <w:rPr>
-          <w:lang w:val="en-US"/>
-        </w:rPr>
-        <w:t xml:space="preserve">te </w:t>
-      </w:r>
-      <w:r>
-        <w:rPr>
-          <w:lang w:val="en-US"/>
-        </w:rPr>
-        <w:t>must take 5 clock cycle per bit</w:t>
-      </w:r>
-      <w:r>
-        <w:rPr>
-          <w:lang w:val="en-US"/>
-        </w:rPr>
-        <w:t xml:space="preserve"> </w:t>
-      </w:r>
-      <w:r>
-        <w:rPr>
-          <w:rFonts w:ascii="Arial" w:hAnsi="Arial" w:cs="Arial"/>
+          <w:rFonts w:ascii="Times New Roman" w:hAnsi="Times New Roman" w:cs="Times New Roman"/>
+          <w:lang w:val="en-US"/>
+        </w:rPr>
+      </w:pPr>
+      <w:r>
+        <w:rPr>
+          <w:rFonts w:ascii="Times New Roman" w:hAnsi="Times New Roman" w:cs="Times New Roman"/>
+          <w:lang w:val="en-US"/>
+        </w:rPr>
+        <w:t xml:space="preserve">Baud-rate must take 5 clock cycle per bit </w:t>
+      </w:r>
+      <w:r>
+        <w:rPr>
+          <w:rFonts w:ascii="Times New Roman" w:hAnsi="Times New Roman" w:cs="Times New Roman"/>
           <w:sz w:val="20"/>
           <w:szCs w:val="20"/>
           <w:lang w:val="en-US" w:eastAsia="en-US"/>
         </w:rPr>
-        <w:t>(</w:t>
-      </w:r>
-      <w:r>
-        <w:rPr>
-          <w:rFonts w:ascii="Arial" w:hAnsi="Arial" w:cs="Arial"/>
+        <w:t xml:space="preserve">(Recommendation </w:t>
+      </w:r>
+      <w:r>
+        <w:rPr>
+          <w:rFonts w:ascii="Times New Roman" w:hAnsi="Times New Roman" w:cs="Times New Roman"/>
           <w:sz w:val="20"/>
           <w:szCs w:val="20"/>
           <w:lang w:val="en-US" w:eastAsia="en-US"/>
         </w:rPr>
-        <w:t xml:space="preserve">Recommendation </w:t>
-      </w:r>
-      <w:r>
-        <w:rPr>
-          <w:rFonts w:ascii="Arial" w:hAnsi="Arial" w:cs="Arial"/>
+        <w:t xml:space="preserve">to </w:t>
+      </w:r>
+      <w:r>
+        <w:rPr>
+          <w:rFonts w:ascii="Times New Roman" w:hAnsi="Times New Roman" w:cs="Times New Roman"/>
           <w:sz w:val="20"/>
           <w:szCs w:val="20"/>
           <w:lang w:val="en-US" w:eastAsia="en-US"/>
         </w:rPr>
-        <w:t xml:space="preserve">to </w:t>
-      </w:r>
-      <w:r>
-        <w:rPr>
-          <w:rFonts w:ascii="Arial" w:hAnsi="Arial" w:cs="Arial"/>
-          <w:sz w:val="20"/>
-          <w:szCs w:val="20"/>
-          <w:lang w:val="en-US" w:eastAsia="en-US"/>
-        </w:rPr>
-        <w:t>use a parameter for this</w:t>
-      </w:r>
-      <w:r>
-        <w:rPr>
-          <w:rFonts w:ascii="Arial" w:hAnsi="Arial" w:cs="Arial"/>
-          <w:sz w:val="20"/>
-          <w:szCs w:val="20"/>
-          <w:lang w:val="en-US" w:eastAsia="en-US"/>
-        </w:rPr>
-        <w:t>)</w:t>
+        <w:t>use a parameter for this)</w:t>
       </w:r>
     </w:p>
     <w:p>
@@ -1754,15 +3023,15 @@
         </w:numPr>
         <w:jc w:val="both"/>
         <w:rPr>
-          <w:rFonts w:ascii="Arial" w:hAnsi="Arial" w:cs="Arial"/>
-          <w:sz w:val="20"/>
-          <w:szCs w:val="20"/>
-          <w:lang w:val="en-US"/>
-        </w:rPr>
-      </w:pPr>
-      <w:r>
-        <w:rPr>
-          <w:rFonts w:ascii="Arial" w:hAnsi="Arial" w:cs="Arial"/>
+          <w:rFonts w:ascii="Times New Roman" w:hAnsi="Times New Roman" w:cs="Times New Roman"/>
+          <w:sz w:val="20"/>
+          <w:szCs w:val="20"/>
+          <w:lang w:val="en-US"/>
+        </w:rPr>
+      </w:pPr>
+      <w:r>
+        <w:rPr>
+          <w:rFonts w:ascii="Times New Roman" w:hAnsi="Times New Roman" w:cs="Times New Roman"/>
           <w:sz w:val="20"/>
           <w:szCs w:val="20"/>
           <w:lang w:val="en-US"/>
@@ -1771,7 +3040,7 @@
       </w:r>
       <w:r>
         <w:rPr>
-          <w:rFonts w:ascii="Arial" w:hAnsi="Arial" w:cs="Arial"/>
+          <w:rFonts w:ascii="Times New Roman" w:hAnsi="Times New Roman" w:cs="Times New Roman"/>
           <w:sz w:val="20"/>
           <w:szCs w:val="20"/>
           <w:lang w:val="en-US"/>
@@ -1780,7 +3049,7 @@
       </w:r>
       <w:r>
         <w:rPr>
-          <w:rFonts w:ascii="Arial" w:hAnsi="Arial" w:cs="Arial"/>
+          <w:rFonts w:ascii="Times New Roman" w:hAnsi="Times New Roman" w:cs="Times New Roman"/>
           <w:sz w:val="20"/>
           <w:szCs w:val="20"/>
           <w:lang w:val="en-US"/>
@@ -1789,7 +3058,7 @@
       </w:r>
       <w:r>
         <w:rPr>
-          <w:rFonts w:ascii="Arial" w:hAnsi="Arial" w:cs="Arial"/>
+          <w:rFonts w:ascii="Times New Roman" w:hAnsi="Times New Roman" w:cs="Times New Roman"/>
           <w:sz w:val="20"/>
           <w:szCs w:val="20"/>
           <w:lang w:val="en-US"/>
@@ -1798,7 +3067,7 @@
       </w:r>
       <w:r>
         <w:rPr>
-          <w:rFonts w:ascii="Arial" w:hAnsi="Arial" w:cs="Arial"/>
+          <w:rFonts w:ascii="Times New Roman" w:hAnsi="Times New Roman" w:cs="Times New Roman"/>
           <w:sz w:val="20"/>
           <w:szCs w:val="20"/>
           <w:lang w:val="en-US"/>
@@ -1807,7 +3076,7 @@
       </w:r>
       <w:r>
         <w:rPr>
-          <w:rFonts w:ascii="Arial" w:hAnsi="Arial" w:cs="Arial"/>
+          <w:rFonts w:ascii="Times New Roman" w:hAnsi="Times New Roman" w:cs="Times New Roman"/>
           <w:sz w:val="20"/>
           <w:szCs w:val="20"/>
           <w:lang w:val="en-US"/>
@@ -1824,15 +3093,15 @@
         </w:numPr>
         <w:jc w:val="both"/>
         <w:rPr>
-          <w:rFonts w:ascii="Arial" w:hAnsi="Arial" w:cs="Arial"/>
-          <w:sz w:val="20"/>
-          <w:szCs w:val="20"/>
-          <w:lang w:val="en-US"/>
-        </w:rPr>
-      </w:pPr>
-      <w:r>
-        <w:rPr>
-          <w:rFonts w:ascii="Arial" w:hAnsi="Arial" w:cs="Arial"/>
+          <w:rFonts w:ascii="Times New Roman" w:hAnsi="Times New Roman" w:cs="Times New Roman"/>
+          <w:sz w:val="20"/>
+          <w:szCs w:val="20"/>
+          <w:lang w:val="en-US"/>
+        </w:rPr>
+      </w:pPr>
+      <w:r>
+        <w:rPr>
+          <w:rFonts w:ascii="Times New Roman" w:hAnsi="Times New Roman" w:cs="Times New Roman"/>
           <w:sz w:val="20"/>
           <w:szCs w:val="20"/>
           <w:lang w:val="en-US"/>
@@ -1841,7 +3110,7 @@
       </w:r>
       <w:r>
         <w:rPr>
-          <w:rFonts w:ascii="Arial" w:hAnsi="Arial" w:cs="Arial"/>
+          <w:rFonts w:ascii="Times New Roman" w:hAnsi="Times New Roman" w:cs="Times New Roman"/>
           <w:sz w:val="20"/>
           <w:szCs w:val="20"/>
           <w:lang w:val="en-US"/>
@@ -1850,7 +3119,7 @@
       </w:r>
       <w:r>
         <w:rPr>
-          <w:rFonts w:ascii="Arial" w:hAnsi="Arial" w:cs="Arial"/>
+          <w:rFonts w:ascii="Times New Roman" w:hAnsi="Times New Roman" w:cs="Times New Roman"/>
           <w:sz w:val="20"/>
           <w:szCs w:val="20"/>
           <w:lang w:val="en-US"/>
@@ -1859,7 +3128,7 @@
       </w:r>
       <w:r>
         <w:rPr>
-          <w:rFonts w:ascii="Arial" w:hAnsi="Arial" w:cs="Arial"/>
+          <w:rFonts w:ascii="Times New Roman" w:hAnsi="Times New Roman" w:cs="Times New Roman"/>
           <w:sz w:val="20"/>
           <w:szCs w:val="20"/>
           <w:lang w:val="en-US"/>
@@ -1868,7 +3137,7 @@
       </w:r>
       <w:r>
         <w:rPr>
-          <w:rFonts w:ascii="Arial" w:hAnsi="Arial" w:cs="Arial"/>
+          <w:rFonts w:ascii="Times New Roman" w:hAnsi="Times New Roman" w:cs="Times New Roman"/>
           <w:sz w:val="20"/>
           <w:szCs w:val="20"/>
           <w:lang w:val="en-US"/>
@@ -1885,15 +3154,15 @@
         </w:numPr>
         <w:jc w:val="both"/>
         <w:rPr>
-          <w:rFonts w:ascii="Arial" w:hAnsi="Arial" w:cs="Arial"/>
-          <w:sz w:val="20"/>
-          <w:szCs w:val="20"/>
-          <w:lang w:val="en-US"/>
-        </w:rPr>
-      </w:pPr>
-      <w:r>
-        <w:rPr>
-          <w:rFonts w:ascii="Arial" w:hAnsi="Arial" w:cs="Arial"/>
+          <w:rFonts w:ascii="Times New Roman" w:hAnsi="Times New Roman" w:cs="Times New Roman"/>
+          <w:sz w:val="20"/>
+          <w:szCs w:val="20"/>
+          <w:lang w:val="en-US"/>
+        </w:rPr>
+      </w:pPr>
+      <w:r>
+        <w:rPr>
+          <w:rFonts w:ascii="Times New Roman" w:hAnsi="Times New Roman" w:cs="Times New Roman"/>
           <w:sz w:val="20"/>
           <w:szCs w:val="20"/>
           <w:lang w:val="en-US"/>
@@ -1902,7 +3171,7 @@
       </w:r>
       <w:r>
         <w:rPr>
-          <w:rFonts w:ascii="Arial" w:hAnsi="Arial" w:cs="Arial"/>
+          <w:rFonts w:ascii="Times New Roman" w:hAnsi="Times New Roman" w:cs="Times New Roman"/>
           <w:sz w:val="20"/>
           <w:szCs w:val="20"/>
           <w:lang w:val="en-US"/>
@@ -1911,7 +3180,7 @@
       </w:r>
       <w:r>
         <w:rPr>
-          <w:rFonts w:ascii="Arial" w:hAnsi="Arial" w:cs="Arial"/>
+          <w:rFonts w:ascii="Times New Roman" w:hAnsi="Times New Roman" w:cs="Times New Roman"/>
           <w:sz w:val="20"/>
           <w:szCs w:val="20"/>
           <w:lang w:val="en-US"/>
@@ -1928,15 +3197,15 @@
         </w:numPr>
         <w:jc w:val="both"/>
         <w:rPr>
-          <w:rFonts w:ascii="Arial" w:hAnsi="Arial" w:cs="Arial"/>
-          <w:sz w:val="20"/>
-          <w:szCs w:val="20"/>
-          <w:lang w:val="en-US"/>
-        </w:rPr>
-      </w:pPr>
-      <w:r>
-        <w:rPr>
-          <w:rFonts w:ascii="Arial" w:hAnsi="Arial" w:cs="Arial"/>
+          <w:rFonts w:ascii="Times New Roman" w:hAnsi="Times New Roman" w:cs="Times New Roman"/>
+          <w:sz w:val="20"/>
+          <w:szCs w:val="20"/>
+          <w:lang w:val="en-US"/>
+        </w:rPr>
+      </w:pPr>
+      <w:r>
+        <w:rPr>
+          <w:rFonts w:ascii="Times New Roman" w:hAnsi="Times New Roman" w:cs="Times New Roman"/>
           <w:sz w:val="20"/>
           <w:szCs w:val="20"/>
           <w:lang w:val="en-US"/>
@@ -1945,7 +3214,7 @@
       </w:r>
       <w:r>
         <w:rPr>
-          <w:rFonts w:ascii="Arial" w:hAnsi="Arial" w:cs="Arial"/>
+          <w:rFonts w:ascii="Times New Roman" w:hAnsi="Times New Roman" w:cs="Times New Roman"/>
           <w:sz w:val="20"/>
           <w:szCs w:val="20"/>
           <w:lang w:val="en-US"/>
@@ -1954,7 +3223,7 @@
       </w:r>
       <w:r>
         <w:rPr>
-          <w:rFonts w:ascii="Arial" w:hAnsi="Arial" w:cs="Arial"/>
+          <w:rFonts w:ascii="Times New Roman" w:hAnsi="Times New Roman" w:cs="Times New Roman"/>
           <w:sz w:val="20"/>
           <w:szCs w:val="20"/>
           <w:lang w:val="en-US"/>
@@ -1963,7 +3232,7 @@
       </w:r>
       <w:r>
         <w:rPr>
-          <w:rFonts w:ascii="Arial" w:hAnsi="Arial" w:cs="Arial"/>
+          <w:rFonts w:ascii="Times New Roman" w:hAnsi="Times New Roman" w:cs="Times New Roman"/>
           <w:sz w:val="20"/>
           <w:szCs w:val="20"/>
           <w:lang w:val="en-US"/>
@@ -1972,7 +3241,7 @@
       </w:r>
       <w:r>
         <w:rPr>
-          <w:rFonts w:ascii="Arial" w:hAnsi="Arial" w:cs="Arial"/>
+          <w:rFonts w:ascii="Times New Roman" w:hAnsi="Times New Roman" w:cs="Times New Roman"/>
           <w:sz w:val="20"/>
           <w:szCs w:val="20"/>
           <w:lang w:val="en-US"/>
@@ -1981,7 +3250,7 @@
       </w:r>
       <w:r>
         <w:rPr>
-          <w:rFonts w:ascii="Arial" w:hAnsi="Arial" w:cs="Arial"/>
+          <w:rFonts w:ascii="Times New Roman" w:hAnsi="Times New Roman" w:cs="Times New Roman"/>
           <w:sz w:val="20"/>
           <w:szCs w:val="20"/>
           <w:lang w:val="en-US"/>
@@ -1990,7 +3259,7 @@
       </w:r>
       <w:r>
         <w:rPr>
-          <w:rFonts w:ascii="Arial" w:hAnsi="Arial" w:cs="Arial"/>
+          <w:rFonts w:ascii="Times New Roman" w:hAnsi="Times New Roman" w:cs="Times New Roman"/>
           <w:sz w:val="20"/>
           <w:szCs w:val="20"/>
           <w:lang w:val="en-US"/>
@@ -1999,7 +3268,7 @@
       </w:r>
       <w:r>
         <w:rPr>
-          <w:rFonts w:ascii="Arial" w:hAnsi="Arial" w:cs="Arial"/>
+          <w:rFonts w:ascii="Times New Roman" w:hAnsi="Times New Roman" w:cs="Times New Roman"/>
           <w:sz w:val="20"/>
           <w:szCs w:val="20"/>
           <w:lang w:val="en-US"/>
@@ -2016,15 +3285,15 @@
         </w:numPr>
         <w:jc w:val="both"/>
         <w:rPr>
-          <w:rFonts w:ascii="Arial" w:hAnsi="Arial" w:cs="Arial"/>
-          <w:sz w:val="20"/>
-          <w:szCs w:val="20"/>
-          <w:lang w:val="en-US"/>
-        </w:rPr>
-      </w:pPr>
-      <w:r>
-        <w:rPr>
-          <w:rFonts w:ascii="Arial" w:hAnsi="Arial" w:cs="Arial"/>
+          <w:rFonts w:ascii="Times New Roman" w:hAnsi="Times New Roman" w:cs="Times New Roman"/>
+          <w:sz w:val="20"/>
+          <w:szCs w:val="20"/>
+          <w:lang w:val="en-US"/>
+        </w:rPr>
+      </w:pPr>
+      <w:r>
+        <w:rPr>
+          <w:rFonts w:ascii="Times New Roman" w:hAnsi="Times New Roman" w:cs="Times New Roman"/>
           <w:sz w:val="20"/>
           <w:szCs w:val="20"/>
           <w:lang w:val="en-US"/>
@@ -2033,7 +3302,7 @@
       </w:r>
       <w:r>
         <w:rPr>
-          <w:rFonts w:ascii="Arial" w:hAnsi="Arial" w:cs="Arial"/>
+          <w:rFonts w:ascii="Times New Roman" w:hAnsi="Times New Roman" w:cs="Times New Roman"/>
           <w:sz w:val="20"/>
           <w:szCs w:val="20"/>
           <w:lang w:val="en-US"/>
@@ -2042,7 +3311,7 @@
       </w:r>
       <w:r>
         <w:rPr>
-          <w:rFonts w:ascii="Arial" w:hAnsi="Arial" w:cs="Arial"/>
+          <w:rFonts w:ascii="Times New Roman" w:hAnsi="Times New Roman" w:cs="Times New Roman"/>
           <w:sz w:val="20"/>
           <w:szCs w:val="20"/>
           <w:lang w:val="en-US"/>
@@ -2051,7 +3320,7 @@
       </w:r>
       <w:r>
         <w:rPr>
-          <w:rFonts w:ascii="Arial" w:hAnsi="Arial" w:cs="Arial"/>
+          <w:rFonts w:ascii="Times New Roman" w:hAnsi="Times New Roman" w:cs="Times New Roman"/>
           <w:sz w:val="20"/>
           <w:szCs w:val="20"/>
           <w:lang w:val="en-US"/>
@@ -2063,7 +3332,6 @@
       <w:pPr>
         <w:jc w:val="center"/>
         <w:rPr>
-          <w:rFonts w:ascii="Arial" w:hAnsi="Arial" w:cs="Arial"/>
           <w:sz w:val="20"/>
           <w:szCs w:val="20"/>
           <w:lang w:val="en-US"/>
@@ -2074,7 +3342,6 @@
       <w:pPr>
         <w:jc w:val="center"/>
         <w:rPr>
-          <w:rFonts w:ascii="Arial" w:hAnsi="Arial" w:cs="Arial"/>
           <w:sz w:val="20"/>
           <w:szCs w:val="20"/>
           <w:lang w:val="en-US"/>
@@ -2085,7 +3352,6 @@
       <w:pPr>
         <w:jc w:val="center"/>
         <w:rPr>
-          <w:rFonts w:ascii="Arial" w:hAnsi="Arial" w:cs="Arial"/>
           <w:sz w:val="20"/>
           <w:szCs w:val="20"/>
           <w:lang w:val="en-US"/>
@@ -2096,15 +3362,13 @@
       <w:pPr>
         <w:jc w:val="both"/>
         <w:rPr>
-          <w:rFonts w:ascii="Arial" w:hAnsi="Arial" w:cs="Arial"/>
-          <w:sz w:val="20"/>
-          <w:szCs w:val="20"/>
-          <w:lang w:val="en-US"/>
-        </w:rPr>
-      </w:pPr>
-      <w:r>
-        <w:rPr>
-          <w:rFonts w:ascii="Arial" w:hAnsi="Arial" w:cs="Arial"/>
+          <w:sz w:val="20"/>
+          <w:szCs w:val="20"/>
+          <w:lang w:val="en-US"/>
+        </w:rPr>
+      </w:pPr>
+      <w:r>
+        <w:rPr>
           <w:sz w:val="20"/>
           <w:szCs w:val="20"/>
           <w:lang w:val="en-US"/>
@@ -2113,7 +3377,6 @@
       </w:r>
       <w:r>
         <w:rPr>
-          <w:rFonts w:ascii="Arial" w:hAnsi="Arial" w:cs="Arial"/>
           <w:sz w:val="20"/>
           <w:szCs w:val="20"/>
           <w:lang w:val="en-US"/>
@@ -2122,7 +3385,6 @@
       </w:r>
       <w:r>
         <w:rPr>
-          <w:rFonts w:ascii="Arial" w:hAnsi="Arial" w:cs="Arial"/>
           <w:sz w:val="20"/>
           <w:szCs w:val="20"/>
           <w:lang w:val="en-US"/>
@@ -2131,7 +3393,6 @@
       </w:r>
       <w:r>
         <w:rPr>
-          <w:rFonts w:ascii="Arial" w:hAnsi="Arial" w:cs="Arial"/>
           <w:i/>
           <w:iCs/>
           <w:sz w:val="20"/>
@@ -2142,7 +3403,6 @@
       </w:r>
       <w:r>
         <w:rPr>
-          <w:rFonts w:ascii="Arial" w:hAnsi="Arial" w:cs="Arial"/>
           <w:i/>
           <w:iCs/>
           <w:sz w:val="20"/>
@@ -2153,7 +3413,6 @@
       </w:r>
       <w:r>
         <w:rPr>
-          <w:rFonts w:ascii="Arial" w:hAnsi="Arial" w:cs="Arial"/>
           <w:i/>
           <w:iCs/>
           <w:sz w:val="20"/>
@@ -2164,7 +3423,6 @@
       </w:r>
       <w:r>
         <w:rPr>
-          <w:rFonts w:ascii="Arial" w:hAnsi="Arial" w:cs="Arial"/>
           <w:sz w:val="20"/>
           <w:szCs w:val="20"/>
           <w:lang w:val="en-US"/>
@@ -2173,7 +3431,6 @@
       </w:r>
       <w:r>
         <w:rPr>
-          <w:rFonts w:ascii="Arial" w:hAnsi="Arial" w:cs="Arial"/>
           <w:sz w:val="20"/>
           <w:szCs w:val="20"/>
           <w:lang w:val="en-US"/>
@@ -2182,7 +3439,6 @@
       </w:r>
       <w:r>
         <w:rPr>
-          <w:rFonts w:ascii="Arial" w:hAnsi="Arial" w:cs="Arial"/>
           <w:sz w:val="20"/>
           <w:szCs w:val="20"/>
           <w:lang w:val="en-US"/>
@@ -2194,15 +3450,13 @@
       <w:pPr>
         <w:jc w:val="both"/>
         <w:rPr>
-          <w:rFonts w:ascii="Arial" w:hAnsi="Arial" w:cs="Arial"/>
-          <w:sz w:val="20"/>
-          <w:szCs w:val="20"/>
-          <w:lang w:val="en-US"/>
-        </w:rPr>
-      </w:pPr>
-      <w:r>
-        <w:rPr>
-          <w:rFonts w:ascii="Arial" w:hAnsi="Arial" w:cs="Arial"/>
+          <w:sz w:val="20"/>
+          <w:szCs w:val="20"/>
+          <w:lang w:val="en-US"/>
+        </w:rPr>
+      </w:pPr>
+      <w:r>
+        <w:rPr>
           <w:sz w:val="20"/>
           <w:szCs w:val="20"/>
           <w:lang w:val="en-US"/>
@@ -2211,16 +3465,32 @@
       </w:r>
       <w:r>
         <w:rPr>
-          <w:rFonts w:ascii="Arial" w:hAnsi="Arial" w:cs="Arial"/>
-          <w:sz w:val="20"/>
-          <w:szCs w:val="20"/>
-          <w:lang w:val="en-US"/>
-        </w:rPr>
-        <w:t xml:space="preserve">The use of a clock faster than baudrate is to fix synchronization between </w:t>
-      </w:r>
-      <w:r>
-        <w:rPr>
-          <w:rFonts w:ascii="Arial" w:hAnsi="Arial" w:cs="Arial"/>
+          <w:sz w:val="20"/>
+          <w:szCs w:val="20"/>
+          <w:lang w:val="en-US"/>
+        </w:rPr>
+        <w:t xml:space="preserve">The use of a clock faster than </w:t>
+      </w:r>
+      <w:proofErr w:type="spellStart"/>
+      <w:r>
+        <w:rPr>
+          <w:sz w:val="20"/>
+          <w:szCs w:val="20"/>
+          <w:lang w:val="en-US"/>
+        </w:rPr>
+        <w:t>baudrate</w:t>
+      </w:r>
+      <w:proofErr w:type="spellEnd"/>
+      <w:r>
+        <w:rPr>
+          <w:sz w:val="20"/>
+          <w:szCs w:val="20"/>
+          <w:lang w:val="en-US"/>
+        </w:rPr>
+        <w:t xml:space="preserve"> is to fix synchronization between </w:t>
+      </w:r>
+      <w:r>
+        <w:rPr>
           <w:sz w:val="20"/>
           <w:szCs w:val="20"/>
           <w:lang w:val="en-US"/>
@@ -2229,7 +3499,6 @@
       </w:r>
       <w:r>
         <w:rPr>
-          <w:rFonts w:ascii="Arial" w:hAnsi="Arial" w:cs="Arial"/>
           <w:sz w:val="20"/>
           <w:szCs w:val="20"/>
           <w:lang w:val="en-US"/>
@@ -2238,7 +3507,6 @@
       </w:r>
       <w:r>
         <w:rPr>
-          <w:rFonts w:ascii="Arial" w:hAnsi="Arial" w:cs="Arial"/>
           <w:sz w:val="20"/>
           <w:szCs w:val="20"/>
           <w:lang w:val="en-US"/>
@@ -2247,7 +3515,6 @@
       </w:r>
       <w:r>
         <w:rPr>
-          <w:rFonts w:ascii="Arial" w:hAnsi="Arial" w:cs="Arial"/>
           <w:sz w:val="20"/>
           <w:szCs w:val="20"/>
           <w:vertAlign w:val="superscript"/>
@@ -2257,7 +3524,6 @@
       </w:r>
       <w:r>
         <w:rPr>
-          <w:rFonts w:ascii="Arial" w:hAnsi="Arial" w:cs="Arial"/>
           <w:sz w:val="20"/>
           <w:szCs w:val="20"/>
           <w:lang w:val="en-US"/>
@@ -2269,7 +3535,6 @@
       <w:pPr>
         <w:jc w:val="both"/>
         <w:rPr>
-          <w:rFonts w:ascii="Arial" w:hAnsi="Arial" w:cs="Arial"/>
           <w:sz w:val="20"/>
           <w:szCs w:val="20"/>
           <w:lang w:val="en-US"/>
@@ -2280,15 +3545,13 @@
       <w:pPr>
         <w:jc w:val="both"/>
         <w:rPr>
-          <w:rFonts w:ascii="Arial" w:hAnsi="Arial" w:cs="Arial"/>
-          <w:sz w:val="20"/>
-          <w:szCs w:val="20"/>
-          <w:lang w:val="en-US"/>
-        </w:rPr>
-      </w:pPr>
-      <w:r>
-        <w:rPr>
-          <w:rFonts w:ascii="Arial" w:hAnsi="Arial" w:cs="Arial"/>
+          <w:sz w:val="20"/>
+          <w:szCs w:val="20"/>
+          <w:lang w:val="en-US"/>
+        </w:rPr>
+      </w:pPr>
+      <w:r>
+        <w:rPr>
           <w:sz w:val="20"/>
           <w:szCs w:val="20"/>
           <w:lang w:val="en-US"/>
@@ -2305,15 +3568,15 @@
         </w:numPr>
         <w:jc w:val="both"/>
         <w:rPr>
-          <w:rFonts w:ascii="Arial" w:hAnsi="Arial" w:cs="Arial"/>
-          <w:sz w:val="20"/>
-          <w:szCs w:val="20"/>
-          <w:lang w:val="en-US"/>
-        </w:rPr>
-      </w:pPr>
-      <w:r>
-        <w:rPr>
-          <w:rFonts w:ascii="Arial" w:hAnsi="Arial" w:cs="Arial"/>
+          <w:rFonts w:ascii="Times New Roman" w:hAnsi="Times New Roman" w:cs="Times New Roman"/>
+          <w:sz w:val="20"/>
+          <w:szCs w:val="20"/>
+          <w:lang w:val="en-US"/>
+        </w:rPr>
+      </w:pPr>
+      <w:r>
+        <w:rPr>
+          <w:rFonts w:ascii="Times New Roman" w:hAnsi="Times New Roman" w:cs="Times New Roman"/>
           <w:sz w:val="20"/>
           <w:szCs w:val="20"/>
           <w:lang w:val="en-US"/>
@@ -2322,7 +3585,7 @@
       </w:r>
       <w:r>
         <w:rPr>
-          <w:rFonts w:ascii="Arial" w:hAnsi="Arial" w:cs="Arial"/>
+          <w:rFonts w:ascii="Times New Roman" w:hAnsi="Times New Roman" w:cs="Times New Roman"/>
           <w:sz w:val="20"/>
           <w:szCs w:val="20"/>
           <w:lang w:val="en-US"/>
@@ -2331,7 +3594,7 @@
       </w:r>
       <w:r>
         <w:rPr>
-          <w:rFonts w:ascii="Arial" w:hAnsi="Arial" w:cs="Arial"/>
+          <w:rFonts w:ascii="Times New Roman" w:hAnsi="Times New Roman" w:cs="Times New Roman"/>
           <w:sz w:val="20"/>
           <w:szCs w:val="20"/>
           <w:lang w:val="en-US"/>
@@ -2340,7 +3603,7 @@
       </w:r>
       <w:r>
         <w:rPr>
-          <w:rFonts w:ascii="Arial" w:hAnsi="Arial" w:cs="Arial"/>
+          <w:rFonts w:ascii="Times New Roman" w:hAnsi="Times New Roman" w:cs="Times New Roman"/>
           <w:sz w:val="20"/>
           <w:szCs w:val="20"/>
           <w:lang w:val="en-US"/>
@@ -2357,15 +3620,15 @@
         </w:numPr>
         <w:jc w:val="both"/>
         <w:rPr>
-          <w:rFonts w:ascii="Arial" w:hAnsi="Arial" w:cs="Arial"/>
-          <w:sz w:val="20"/>
-          <w:szCs w:val="20"/>
-          <w:lang w:val="en-US"/>
-        </w:rPr>
-      </w:pPr>
-      <w:r>
-        <w:rPr>
-          <w:rFonts w:ascii="Arial" w:hAnsi="Arial" w:cs="Arial"/>
+          <w:rFonts w:ascii="Times New Roman" w:hAnsi="Times New Roman" w:cs="Times New Roman"/>
+          <w:sz w:val="20"/>
+          <w:szCs w:val="20"/>
+          <w:lang w:val="en-US"/>
+        </w:rPr>
+      </w:pPr>
+      <w:r>
+        <w:rPr>
+          <w:rFonts w:ascii="Times New Roman" w:hAnsi="Times New Roman" w:cs="Times New Roman"/>
           <w:sz w:val="20"/>
           <w:szCs w:val="20"/>
           <w:lang w:val="en-US"/>
@@ -2374,8 +3637,8 @@
       </w:r>
     </w:p>
     <w:sectPr>
-      <w:headerReference w:type="default" r:id="rId9"/>
-      <w:footerReference w:type="default" r:id="rId10"/>
+      <w:headerReference w:type="default" r:id="rId16"/>
+      <w:footerReference w:type="default" r:id="rId17"/>
       <w:pgSz w:w="12240" w:h="15840"/>
       <w:pgMar w:top="431" w:right="284" w:bottom="431" w:left="680" w:header="0" w:footer="340" w:gutter="0"/>
       <w:cols w:space="720"/>
@@ -2512,7 +3775,7 @@
         </mc:Choice>
         <mc:Fallback>
           <w:pict>
-            <v:rect w14:anchorId="339854EB" id="Frame1" o:spid="_x0000_s1026" style="position:absolute;margin-left:-45.05pt;margin-top:.05pt;width:6.15pt;height:13.75pt;z-index:-503316474;visibility:visible;mso-wrap-style:square;mso-wrap-distance-left:0;mso-wrap-distance-top:0;mso-wrap-distance-right:0;mso-wrap-distance-bottom:0;mso-position-horizontal:right;mso-position-horizontal-relative:margin;mso-position-vertical:absolute;mso-position-vertical-relative:text;v-text-anchor:top" o:gfxdata="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" filled="f" stroked="f">
+            <v:rect w14:anchorId="339854EB" id="Frame1" o:spid="_x0000_s1027" style="position:absolute;margin-left:-45.05pt;margin-top:.05pt;width:6.15pt;height:13.75pt;z-index:-503316474;visibility:visible;mso-wrap-style:square;mso-wrap-distance-left:0;mso-wrap-distance-top:0;mso-wrap-distance-right:0;mso-wrap-distance-bottom:0;mso-position-horizontal:right;mso-position-horizontal-relative:margin;mso-position-vertical:absolute;mso-position-vertical-relative:text;v-text-anchor:top" o:gfxdata="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" filled="f" stroked="f">
               <v:textbox style="mso-fit-shape-to-text:t" inset="0,0,0,0">
                 <w:txbxContent>
                   <w:p>
@@ -3329,6 +4592,119 @@
     </w:lvl>
   </w:abstractNum>
   <w:abstractNum w:abstractNumId="4" w15:restartNumberingAfterBreak="0">
+    <w:nsid w:val="3D2B6687"/>
+    <w:multiLevelType w:val="hybridMultilevel"/>
+    <w:tmpl w:val="1E82DC2E"/>
+    <w:lvl w:ilvl="0" w:tplc="080A0001">
+      <w:start w:val="1"/>
+      <w:numFmt w:val="bullet"/>
+      <w:lvlText w:val=""/>
+      <w:lvlJc w:val="left"/>
+      <w:pPr>
+        <w:ind w:left="1440" w:hanging="360"/>
+      </w:pPr>
+      <w:rPr>
+        <w:rFonts w:ascii="Symbol" w:hAnsi="Symbol" w:hint="default"/>
+      </w:rPr>
+    </w:lvl>
+    <w:lvl w:ilvl="1" w:tplc="080A0003" w:tentative="1">
+      <w:start w:val="1"/>
+      <w:numFmt w:val="bullet"/>
+      <w:lvlText w:val="o"/>
+      <w:lvlJc w:val="left"/>
+      <w:pPr>
+        <w:ind w:left="2160" w:hanging="360"/>
+      </w:pPr>
+      <w:rPr>
+        <w:rFonts w:ascii="Courier New" w:hAnsi="Courier New" w:cs="Courier New" w:hint="default"/>
+      </w:rPr>
+    </w:lvl>
+    <w:lvl w:ilvl="2" w:tplc="080A0005" w:tentative="1">
+      <w:start w:val="1"/>
+      <w:numFmt w:val="bullet"/>
+      <w:lvlText w:val=""/>
+      <w:lvlJc w:val="left"/>
+      <w:pPr>
+        <w:ind w:left="2880" w:hanging="360"/>
+      </w:pPr>
+      <w:rPr>
+        <w:rFonts w:ascii="Wingdings" w:hAnsi="Wingdings" w:hint="default"/>
+      </w:rPr>
+    </w:lvl>
+    <w:lvl w:ilvl="3" w:tplc="080A0001" w:tentative="1">
+      <w:start w:val="1"/>
+      <w:numFmt w:val="bullet"/>
+      <w:lvlText w:val=""/>
+      <w:lvlJc w:val="left"/>
+      <w:pPr>
+        <w:ind w:left="3600" w:hanging="360"/>
+      </w:pPr>
+      <w:rPr>
+        <w:rFonts w:ascii="Symbol" w:hAnsi="Symbol" w:hint="default"/>
+      </w:rPr>
+    </w:lvl>
+    <w:lvl w:ilvl="4" w:tplc="080A0003" w:tentative="1">
+      <w:start w:val="1"/>
+      <w:numFmt w:val="bullet"/>
+      <w:lvlText w:val="o"/>
+      <w:lvlJc w:val="left"/>
+      <w:pPr>
+        <w:ind w:left="4320" w:hanging="360"/>
+      </w:pPr>
+      <w:rPr>
+        <w:rFonts w:ascii="Courier New" w:hAnsi="Courier New" w:cs="Courier New" w:hint="default"/>
+      </w:rPr>
+    </w:lvl>
+    <w:lvl w:ilvl="5" w:tplc="080A0005" w:tentative="1">
+      <w:start w:val="1"/>
+      <w:numFmt w:val="bullet"/>
+      <w:lvlText w:val=""/>
+      <w:lvlJc w:val="left"/>
+      <w:pPr>
+        <w:ind w:left="5040" w:hanging="360"/>
+      </w:pPr>
+      <w:rPr>
+        <w:rFonts w:ascii="Wingdings" w:hAnsi="Wingdings" w:hint="default"/>
+      </w:rPr>
+    </w:lvl>
+    <w:lvl w:ilvl="6" w:tplc="080A0001" w:tentative="1">
+      <w:start w:val="1"/>
+      <w:numFmt w:val="bullet"/>
+      <w:lvlText w:val=""/>
+      <w:lvlJc w:val="left"/>
+      <w:pPr>
+        <w:ind w:left="5760" w:hanging="360"/>
+      </w:pPr>
+      <w:rPr>
+        <w:rFonts w:ascii="Symbol" w:hAnsi="Symbol" w:hint="default"/>
+      </w:rPr>
+    </w:lvl>
+    <w:lvl w:ilvl="7" w:tplc="080A0003" w:tentative="1">
+      <w:start w:val="1"/>
+      <w:numFmt w:val="bullet"/>
+      <w:lvlText w:val="o"/>
+      <w:lvlJc w:val="left"/>
+      <w:pPr>
+        <w:ind w:left="6480" w:hanging="360"/>
+      </w:pPr>
+      <w:rPr>
+        <w:rFonts w:ascii="Courier New" w:hAnsi="Courier New" w:cs="Courier New" w:hint="default"/>
+      </w:rPr>
+    </w:lvl>
+    <w:lvl w:ilvl="8" w:tplc="080A0005" w:tentative="1">
+      <w:start w:val="1"/>
+      <w:numFmt w:val="bullet"/>
+      <w:lvlText w:val=""/>
+      <w:lvlJc w:val="left"/>
+      <w:pPr>
+        <w:ind w:left="7200" w:hanging="360"/>
+      </w:pPr>
+      <w:rPr>
+        <w:rFonts w:ascii="Wingdings" w:hAnsi="Wingdings" w:hint="default"/>
+      </w:rPr>
+    </w:lvl>
+  </w:abstractNum>
+  <w:abstractNum w:abstractNumId="5" w15:restartNumberingAfterBreak="0">
     <w:nsid w:val="75EB1471"/>
     <w:multiLevelType w:val="multilevel"/>
     <w:tmpl w:val="BC045B48"/>
@@ -3442,8 +4818,157 @@
       </w:rPr>
     </w:lvl>
   </w:abstractNum>
+  <w:abstractNum w:abstractNumId="6" w15:restartNumberingAfterBreak="0">
+    <w:nsid w:val="7D4759CF"/>
+    <w:multiLevelType w:val="multilevel"/>
+    <w:tmpl w:val="544E92DA"/>
+    <w:lvl w:ilvl="0">
+      <w:start w:val="1"/>
+      <w:numFmt w:val="bullet"/>
+      <w:lvlText w:val=""/>
+      <w:lvlJc w:val="left"/>
+      <w:pPr>
+        <w:tabs>
+          <w:tab w:val="num" w:pos="720"/>
+        </w:tabs>
+        <w:ind w:left="720" w:hanging="360"/>
+      </w:pPr>
+      <w:rPr>
+        <w:rFonts w:ascii="Symbol" w:hAnsi="Symbol" w:hint="default"/>
+        <w:sz w:val="20"/>
+      </w:rPr>
+    </w:lvl>
+    <w:lvl w:ilvl="1" w:tentative="1">
+      <w:start w:val="1"/>
+      <w:numFmt w:val="bullet"/>
+      <w:lvlText w:val="o"/>
+      <w:lvlJc w:val="left"/>
+      <w:pPr>
+        <w:tabs>
+          <w:tab w:val="num" w:pos="1440"/>
+        </w:tabs>
+        <w:ind w:left="1440" w:hanging="360"/>
+      </w:pPr>
+      <w:rPr>
+        <w:rFonts w:ascii="Courier New" w:hAnsi="Courier New" w:hint="default"/>
+        <w:sz w:val="20"/>
+      </w:rPr>
+    </w:lvl>
+    <w:lvl w:ilvl="2" w:tentative="1">
+      <w:start w:val="1"/>
+      <w:numFmt w:val="bullet"/>
+      <w:lvlText w:val=""/>
+      <w:lvlJc w:val="left"/>
+      <w:pPr>
+        <w:tabs>
+          <w:tab w:val="num" w:pos="2160"/>
+        </w:tabs>
+        <w:ind w:left="2160" w:hanging="360"/>
+      </w:pPr>
+      <w:rPr>
+        <w:rFonts w:ascii="Wingdings" w:hAnsi="Wingdings" w:hint="default"/>
+        <w:sz w:val="20"/>
+      </w:rPr>
+    </w:lvl>
+    <w:lvl w:ilvl="3" w:tentative="1">
+      <w:start w:val="1"/>
+      <w:numFmt w:val="bullet"/>
+      <w:lvlText w:val=""/>
+      <w:lvlJc w:val="left"/>
+      <w:pPr>
+        <w:tabs>
+          <w:tab w:val="num" w:pos="2880"/>
+        </w:tabs>
+        <w:ind w:left="2880" w:hanging="360"/>
+      </w:pPr>
+      <w:rPr>
+        <w:rFonts w:ascii="Wingdings" w:hAnsi="Wingdings" w:hint="default"/>
+        <w:sz w:val="20"/>
+      </w:rPr>
+    </w:lvl>
+    <w:lvl w:ilvl="4" w:tentative="1">
+      <w:start w:val="1"/>
+      <w:numFmt w:val="bullet"/>
+      <w:lvlText w:val=""/>
+      <w:lvlJc w:val="left"/>
+      <w:pPr>
+        <w:tabs>
+          <w:tab w:val="num" w:pos="3600"/>
+        </w:tabs>
+        <w:ind w:left="3600" w:hanging="360"/>
+      </w:pPr>
+      <w:rPr>
+        <w:rFonts w:ascii="Wingdings" w:hAnsi="Wingdings" w:hint="default"/>
+        <w:sz w:val="20"/>
+      </w:rPr>
+    </w:lvl>
+    <w:lvl w:ilvl="5" w:tentative="1">
+      <w:start w:val="1"/>
+      <w:numFmt w:val="bullet"/>
+      <w:lvlText w:val=""/>
+      <w:lvlJc w:val="left"/>
+      <w:pPr>
+        <w:tabs>
+          <w:tab w:val="num" w:pos="4320"/>
+        </w:tabs>
+        <w:ind w:left="4320" w:hanging="360"/>
+      </w:pPr>
+      <w:rPr>
+        <w:rFonts w:ascii="Wingdings" w:hAnsi="Wingdings" w:hint="default"/>
+        <w:sz w:val="20"/>
+      </w:rPr>
+    </w:lvl>
+    <w:lvl w:ilvl="6" w:tentative="1">
+      <w:start w:val="1"/>
+      <w:numFmt w:val="bullet"/>
+      <w:lvlText w:val=""/>
+      <w:lvlJc w:val="left"/>
+      <w:pPr>
+        <w:tabs>
+          <w:tab w:val="num" w:pos="5040"/>
+        </w:tabs>
+        <w:ind w:left="5040" w:hanging="360"/>
+      </w:pPr>
+      <w:rPr>
+        <w:rFonts w:ascii="Wingdings" w:hAnsi="Wingdings" w:hint="default"/>
+        <w:sz w:val="20"/>
+      </w:rPr>
+    </w:lvl>
+    <w:lvl w:ilvl="7" w:tentative="1">
+      <w:start w:val="1"/>
+      <w:numFmt w:val="bullet"/>
+      <w:lvlText w:val=""/>
+      <w:lvlJc w:val="left"/>
+      <w:pPr>
+        <w:tabs>
+          <w:tab w:val="num" w:pos="5760"/>
+        </w:tabs>
+        <w:ind w:left="5760" w:hanging="360"/>
+      </w:pPr>
+      <w:rPr>
+        <w:rFonts w:ascii="Wingdings" w:hAnsi="Wingdings" w:hint="default"/>
+        <w:sz w:val="20"/>
+      </w:rPr>
+    </w:lvl>
+    <w:lvl w:ilvl="8" w:tentative="1">
+      <w:start w:val="1"/>
+      <w:numFmt w:val="bullet"/>
+      <w:lvlText w:val=""/>
+      <w:lvlJc w:val="left"/>
+      <w:pPr>
+        <w:tabs>
+          <w:tab w:val="num" w:pos="6480"/>
+        </w:tabs>
+        <w:ind w:left="6480" w:hanging="360"/>
+      </w:pPr>
+      <w:rPr>
+        <w:rFonts w:ascii="Wingdings" w:hAnsi="Wingdings" w:hint="default"/>
+        <w:sz w:val="20"/>
+      </w:rPr>
+    </w:lvl>
+  </w:abstractNum>
   <w:num w:numId="1" w16cid:durableId="2065448248">
-    <w:abstractNumId w:val="4"/>
+    <w:abstractNumId w:val="5"/>
   </w:num>
   <w:num w:numId="2" w16cid:durableId="557857290">
     <w:abstractNumId w:val="2"/>
@@ -3456,6 +4981,12 @@
   </w:num>
   <w:num w:numId="5" w16cid:durableId="359622425">
     <w:abstractNumId w:val="3"/>
+  </w:num>
+  <w:num w:numId="6" w16cid:durableId="823204411">
+    <w:abstractNumId w:val="6"/>
+  </w:num>
+  <w:num w:numId="7" w16cid:durableId="190463695">
+    <w:abstractNumId w:val="4"/>
   </w:num>
 </w:numbering>
 </file>
@@ -3876,7 +5407,6 @@
   <w:style w:type="character" w:default="1" w:styleId="DefaultParagraphFont">
     <w:name w:val="Default Paragraph Font"/>
     <w:uiPriority w:val="1"/>
-    <w:semiHidden/>
     <w:unhideWhenUsed/>
   </w:style>
   <w:style w:type="table" w:default="1" w:styleId="TableNormal">

</xml_diff>

<commit_message>
commit con feedback del maestro
</commit_message>
<xml_diff>
--- a/DVVDS/T5.0/Task 5.docx
+++ b/DVVDS/T5.0/Task 5.docx
@@ -1151,256 +1151,29 @@
     </w:p>
     <w:p>
       <w:pPr>
-        <w:jc w:val="both"/>
-        <w:rPr>
-          <w:sz w:val="20"/>
-          <w:szCs w:val="20"/>
-          <w:lang w:val="en-US" w:eastAsia="en-US"/>
-        </w:rPr>
-      </w:pPr>
-      <w:r>
-        <w:rPr>
-          <w:sz w:val="20"/>
-          <w:szCs w:val="20"/>
-          <w:lang w:val="en-US" w:eastAsia="en-US"/>
-        </w:rPr>
-        <w:drawing>
-          <wp:inline distT="0" distB="0" distL="0" distR="0" wp14:anchorId="2F9C15BC" wp14:editId="28F4C396">
-            <wp:extent cx="5459809" cy="2941983"/>
-            <wp:effectExtent l="0" t="0" r="7620" b="0"/>
-            <wp:docPr id="1022701124" name="Picture 1"/>
-            <wp:cNvGraphicFramePr>
-              <a:graphicFrameLocks xmlns:a="http://schemas.openxmlformats.org/drawingml/2006/main" noChangeAspect="1"/>
-            </wp:cNvGraphicFramePr>
-            <a:graphic xmlns:a="http://schemas.openxmlformats.org/drawingml/2006/main">
-              <a:graphicData uri="http://schemas.openxmlformats.org/drawingml/2006/picture">
-                <pic:pic xmlns:pic="http://schemas.openxmlformats.org/drawingml/2006/picture">
-                  <pic:nvPicPr>
-                    <pic:cNvPr id="1022701124" name=""/>
-                    <pic:cNvPicPr/>
-                  </pic:nvPicPr>
-                  <pic:blipFill>
-                    <a:blip r:embed="rId9"/>
-                    <a:stretch>
-                      <a:fillRect/>
-                    </a:stretch>
-                  </pic:blipFill>
-                  <pic:spPr>
-                    <a:xfrm>
-                      <a:off x="0" y="0"/>
-                      <a:ext cx="5481177" cy="2953497"/>
-                    </a:xfrm>
-                    <a:prstGeom prst="rect">
-                      <a:avLst/>
-                    </a:prstGeom>
-                  </pic:spPr>
-                </pic:pic>
-              </a:graphicData>
-            </a:graphic>
-          </wp:inline>
-        </w:drawing>
-      </w:r>
-    </w:p>
-    <w:p>
-      <w:pPr>
-        <w:jc w:val="both"/>
-        <w:rPr>
-          <w:sz w:val="20"/>
-          <w:szCs w:val="20"/>
-          <w:lang w:val="en-US" w:eastAsia="en-US"/>
-        </w:rPr>
-      </w:pPr>
-      <w:r>
-        <w:rPr>
-          <w:sz w:val="20"/>
-          <w:szCs w:val="20"/>
-          <w:lang w:val="en-US" w:eastAsia="en-US"/>
-        </w:rPr>
-        <w:lastRenderedPageBreak/>
-        <w:drawing>
-          <wp:inline distT="0" distB="0" distL="0" distR="0" wp14:anchorId="1334B4FD" wp14:editId="26C21CAC">
-            <wp:extent cx="4887785" cy="2615979"/>
-            <wp:effectExtent l="0" t="0" r="8255" b="0"/>
-            <wp:docPr id="730637658" name="Picture 1"/>
-            <wp:cNvGraphicFramePr>
-              <a:graphicFrameLocks xmlns:a="http://schemas.openxmlformats.org/drawingml/2006/main" noChangeAspect="1"/>
-            </wp:cNvGraphicFramePr>
-            <a:graphic xmlns:a="http://schemas.openxmlformats.org/drawingml/2006/main">
-              <a:graphicData uri="http://schemas.openxmlformats.org/drawingml/2006/picture">
-                <pic:pic xmlns:pic="http://schemas.openxmlformats.org/drawingml/2006/picture">
-                  <pic:nvPicPr>
-                    <pic:cNvPr id="730637658" name=""/>
-                    <pic:cNvPicPr/>
-                  </pic:nvPicPr>
-                  <pic:blipFill>
-                    <a:blip r:embed="rId10"/>
-                    <a:stretch>
-                      <a:fillRect/>
-                    </a:stretch>
-                  </pic:blipFill>
-                  <pic:spPr>
-                    <a:xfrm>
-                      <a:off x="0" y="0"/>
-                      <a:ext cx="4899868" cy="2622446"/>
-                    </a:xfrm>
-                    <a:prstGeom prst="rect">
-                      <a:avLst/>
-                    </a:prstGeom>
-                  </pic:spPr>
-                </pic:pic>
-              </a:graphicData>
-            </a:graphic>
-          </wp:inline>
-        </w:drawing>
-      </w:r>
-    </w:p>
-    <w:p>
-      <w:pPr>
-        <w:jc w:val="both"/>
-        <w:rPr>
-          <w:sz w:val="20"/>
-          <w:szCs w:val="20"/>
-          <w:lang w:val="en-US" w:eastAsia="en-US"/>
-        </w:rPr>
-      </w:pPr>
-      <w:r>
-        <w:rPr>
-          <w:sz w:val="20"/>
-          <w:szCs w:val="20"/>
-          <w:lang w:val="en-US" w:eastAsia="en-US"/>
-        </w:rPr>
-        <w:drawing>
-          <wp:inline distT="0" distB="0" distL="0" distR="0" wp14:anchorId="2C9898D3" wp14:editId="228A0FA1">
-            <wp:extent cx="4898004" cy="2621449"/>
-            <wp:effectExtent l="0" t="0" r="0" b="7620"/>
-            <wp:docPr id="34593907" name="Picture 1"/>
-            <wp:cNvGraphicFramePr>
-              <a:graphicFrameLocks xmlns:a="http://schemas.openxmlformats.org/drawingml/2006/main" noChangeAspect="1"/>
-            </wp:cNvGraphicFramePr>
-            <a:graphic xmlns:a="http://schemas.openxmlformats.org/drawingml/2006/main">
-              <a:graphicData uri="http://schemas.openxmlformats.org/drawingml/2006/picture">
-                <pic:pic xmlns:pic="http://schemas.openxmlformats.org/drawingml/2006/picture">
-                  <pic:nvPicPr>
-                    <pic:cNvPr id="34593907" name=""/>
-                    <pic:cNvPicPr/>
-                  </pic:nvPicPr>
-                  <pic:blipFill>
-                    <a:blip r:embed="rId11"/>
-                    <a:stretch>
-                      <a:fillRect/>
-                    </a:stretch>
-                  </pic:blipFill>
-                  <pic:spPr>
-                    <a:xfrm>
-                      <a:off x="0" y="0"/>
-                      <a:ext cx="4904740" cy="2625054"/>
-                    </a:xfrm>
-                    <a:prstGeom prst="rect">
-                      <a:avLst/>
-                    </a:prstGeom>
-                  </pic:spPr>
-                </pic:pic>
-              </a:graphicData>
-            </a:graphic>
-          </wp:inline>
-        </w:drawing>
-      </w:r>
-    </w:p>
-    <w:p>
-      <w:pPr>
         <w:rPr>
           <w:sz w:val="22"/>
           <w:szCs w:val="22"/>
           <w:lang w:val="en-US" w:eastAsia="en-US"/>
         </w:rPr>
       </w:pPr>
-      <w:r>
-        <w:rPr>
-          <w:sz w:val="20"/>
-          <w:szCs w:val="20"/>
-          <w:lang w:val="en-US" w:eastAsia="en-US"/>
-        </w:rPr>
-        <w:drawing>
-          <wp:inline distT="0" distB="0" distL="0" distR="0" wp14:anchorId="218A3001" wp14:editId="28FB4A2B">
-            <wp:extent cx="5126832" cy="2687541"/>
-            <wp:effectExtent l="0" t="0" r="0" b="0"/>
-            <wp:docPr id="1521244008" name="Picture 1"/>
-            <wp:cNvGraphicFramePr>
-              <a:graphicFrameLocks xmlns:a="http://schemas.openxmlformats.org/drawingml/2006/main" noChangeAspect="1"/>
-            </wp:cNvGraphicFramePr>
-            <a:graphic xmlns:a="http://schemas.openxmlformats.org/drawingml/2006/main">
-              <a:graphicData uri="http://schemas.openxmlformats.org/drawingml/2006/picture">
-                <pic:pic xmlns:pic="http://schemas.openxmlformats.org/drawingml/2006/picture">
-                  <pic:nvPicPr>
-                    <pic:cNvPr id="1521244008" name=""/>
-                    <pic:cNvPicPr/>
-                  </pic:nvPicPr>
-                  <pic:blipFill>
-                    <a:blip r:embed="rId12"/>
-                    <a:stretch>
-                      <a:fillRect/>
-                    </a:stretch>
-                  </pic:blipFill>
-                  <pic:spPr>
-                    <a:xfrm>
-                      <a:off x="0" y="0"/>
-                      <a:ext cx="5135856" cy="2692271"/>
-                    </a:xfrm>
-                    <a:prstGeom prst="rect">
-                      <a:avLst/>
-                    </a:prstGeom>
-                  </pic:spPr>
-                </pic:pic>
-              </a:graphicData>
-            </a:graphic>
-          </wp:inline>
-        </w:drawing>
-      </w:r>
-    </w:p>
-    <w:p>
-      <w:pPr>
+    </w:p>
+    <w:p>
+      <w:pPr>
+        <w:jc w:val="center"/>
         <w:rPr>
           <w:sz w:val="22"/>
           <w:szCs w:val="22"/>
           <w:lang w:val="en-US" w:eastAsia="en-US"/>
         </w:rPr>
       </w:pPr>
-    </w:p>
-    <w:p>
-      <w:pPr>
+      <w:proofErr w:type="spellStart"/>
+      <w:r>
         <w:rPr>
           <w:sz w:val="22"/>
           <w:szCs w:val="22"/>
           <w:lang w:val="en-US" w:eastAsia="en-US"/>
         </w:rPr>
-      </w:pPr>
-    </w:p>
-    <w:p>
-      <w:pPr>
-        <w:rPr>
-          <w:sz w:val="22"/>
-          <w:szCs w:val="22"/>
-          <w:lang w:val="en-US" w:eastAsia="en-US"/>
-        </w:rPr>
-      </w:pPr>
-    </w:p>
-    <w:p>
-      <w:pPr>
-        <w:jc w:val="center"/>
-        <w:rPr>
-          <w:sz w:val="22"/>
-          <w:szCs w:val="22"/>
-          <w:lang w:val="en-US" w:eastAsia="en-US"/>
-        </w:rPr>
-      </w:pPr>
-      <w:proofErr w:type="spellStart"/>
-      <w:r>
-        <w:rPr>
-          <w:sz w:val="22"/>
-          <w:szCs w:val="22"/>
-          <w:lang w:val="en-US" w:eastAsia="en-US"/>
-        </w:rPr>
-        <w:lastRenderedPageBreak/>
         <w:t>Diagrama</w:t>
       </w:r>
       <w:proofErr w:type="spellEnd"/>
@@ -1466,7 +1239,7 @@
                     </pic:cNvPicPr>
                   </pic:nvPicPr>
                   <pic:blipFill>
-                    <a:blip r:embed="rId13" cstate="print">
+                    <a:blip r:embed="rId9" cstate="print">
                       <a:extLst>
                         <a:ext uri="{28A0092B-C50C-407E-A947-70E740481C1C}">
                           <a14:useLocalDpi xmlns:a14="http://schemas.microsoft.com/office/drawing/2010/main" val="0"/>
@@ -1731,6 +1504,7 @@
           <w:szCs w:val="22"/>
           <w:lang w:val="en-US" w:eastAsia="en-US"/>
         </w:rPr>
+        <w:lastRenderedPageBreak/>
         <w:drawing>
           <wp:inline distT="0" distB="0" distL="0" distR="0" wp14:anchorId="1B8130EE" wp14:editId="53D4D910">
             <wp:extent cx="4851070" cy="3942080"/>
@@ -1749,7 +1523,7 @@
                     </pic:cNvPicPr>
                   </pic:nvPicPr>
                   <pic:blipFill>
-                    <a:blip r:embed="rId14" cstate="print">
+                    <a:blip r:embed="rId10" cstate="print">
                       <a:extLst>
                         <a:ext uri="{28A0092B-C50C-407E-A947-70E740481C1C}">
                           <a14:useLocalDpi xmlns:a14="http://schemas.microsoft.com/office/drawing/2010/main" val="0"/>
@@ -2076,7 +1850,6 @@
           <w:szCs w:val="22"/>
           <w:lang w:eastAsia="en-US"/>
         </w:rPr>
-        <w:lastRenderedPageBreak/>
         <w:t xml:space="preserve">Diagrama de arquitectura de la UART en caso de </w:t>
       </w:r>
       <w:proofErr w:type="spellStart"/>
@@ -2105,6 +1878,7 @@
           <w:szCs w:val="20"/>
           <w:lang w:eastAsia="en-US"/>
         </w:rPr>
+        <w:lastRenderedPageBreak/>
         <mc:AlternateContent>
           <mc:Choice Requires="wps">
             <w:drawing>
@@ -2375,7 +2149,7 @@
                     </pic:cNvPicPr>
                   </pic:nvPicPr>
                   <pic:blipFill>
-                    <a:blip r:embed="rId15" cstate="print">
+                    <a:blip r:embed="rId11" cstate="print">
                       <a:extLst>
                         <a:ext uri="{28A0092B-C50C-407E-A947-70E740481C1C}">
                           <a14:useLocalDpi xmlns:a14="http://schemas.microsoft.com/office/drawing/2010/main" val="0"/>
@@ -2486,6 +2260,26 @@
           <w:lang w:eastAsia="en-US"/>
         </w:rPr>
       </w:pPr>
+    </w:p>
+    <w:p>
+      <w:pPr>
+        <w:jc w:val="both"/>
+        <w:rPr>
+          <w:sz w:val="20"/>
+          <w:szCs w:val="20"/>
+          <w:lang w:eastAsia="en-US"/>
+        </w:rPr>
+      </w:pPr>
+    </w:p>
+    <w:p>
+      <w:pPr>
+        <w:jc w:val="both"/>
+        <w:rPr>
+          <w:sz w:val="20"/>
+          <w:szCs w:val="20"/>
+          <w:lang w:eastAsia="en-US"/>
+        </w:rPr>
+      </w:pPr>
       <w:proofErr w:type="spellStart"/>
       <w:r>
         <w:rPr>
@@ -2493,7 +2287,136 @@
           <w:szCs w:val="20"/>
           <w:lang w:eastAsia="en-US"/>
         </w:rPr>
-        <w:lastRenderedPageBreak/>
+        <w:t>Feedback</w:t>
+      </w:r>
+      <w:proofErr w:type="spellEnd"/>
+      <w:r>
+        <w:rPr>
+          <w:sz w:val="20"/>
+          <w:szCs w:val="20"/>
+          <w:lang w:eastAsia="en-US"/>
+        </w:rPr>
+        <w:t>:</w:t>
+      </w:r>
+    </w:p>
+    <w:p>
+      <w:pPr>
+        <w:jc w:val="both"/>
+        <w:rPr>
+          <w:sz w:val="20"/>
+          <w:szCs w:val="20"/>
+          <w:lang w:eastAsia="en-US"/>
+        </w:rPr>
+      </w:pPr>
+      <w:r>
+        <w:rPr>
+          <w:sz w:val="20"/>
+          <w:szCs w:val="20"/>
+          <w:lang w:eastAsia="en-US"/>
+        </w:rPr>
+        <w:drawing>
+          <wp:inline distT="0" distB="0" distL="0" distR="0" wp14:anchorId="29BD18F0" wp14:editId="15A4E32B">
+            <wp:extent cx="7160260" cy="2011045"/>
+            <wp:effectExtent l="0" t="0" r="2540" b="8255"/>
+            <wp:docPr id="1125431744" name="Picture 1"/>
+            <wp:cNvGraphicFramePr>
+              <a:graphicFrameLocks xmlns:a="http://schemas.openxmlformats.org/drawingml/2006/main" noChangeAspect="1"/>
+            </wp:cNvGraphicFramePr>
+            <a:graphic xmlns:a="http://schemas.openxmlformats.org/drawingml/2006/main">
+              <a:graphicData uri="http://schemas.openxmlformats.org/drawingml/2006/picture">
+                <pic:pic xmlns:pic="http://schemas.openxmlformats.org/drawingml/2006/picture">
+                  <pic:nvPicPr>
+                    <pic:cNvPr id="1125431744" name=""/>
+                    <pic:cNvPicPr/>
+                  </pic:nvPicPr>
+                  <pic:blipFill>
+                    <a:blip r:embed="rId12"/>
+                    <a:stretch>
+                      <a:fillRect/>
+                    </a:stretch>
+                  </pic:blipFill>
+                  <pic:spPr>
+                    <a:xfrm>
+                      <a:off x="0" y="0"/>
+                      <a:ext cx="7160260" cy="2011045"/>
+                    </a:xfrm>
+                    <a:prstGeom prst="rect">
+                      <a:avLst/>
+                    </a:prstGeom>
+                  </pic:spPr>
+                </pic:pic>
+              </a:graphicData>
+            </a:graphic>
+          </wp:inline>
+        </w:drawing>
+      </w:r>
+    </w:p>
+    <w:p>
+      <w:pPr>
+        <w:jc w:val="both"/>
+        <w:rPr>
+          <w:sz w:val="20"/>
+          <w:szCs w:val="20"/>
+          <w:lang w:eastAsia="en-US"/>
+        </w:rPr>
+      </w:pPr>
+    </w:p>
+    <w:p>
+      <w:pPr>
+        <w:jc w:val="both"/>
+        <w:rPr>
+          <w:sz w:val="20"/>
+          <w:szCs w:val="20"/>
+          <w:lang w:eastAsia="en-US"/>
+        </w:rPr>
+      </w:pPr>
+    </w:p>
+    <w:p>
+      <w:pPr>
+        <w:jc w:val="both"/>
+        <w:rPr>
+          <w:sz w:val="20"/>
+          <w:szCs w:val="20"/>
+          <w:lang w:eastAsia="en-US"/>
+        </w:rPr>
+      </w:pPr>
+    </w:p>
+    <w:p>
+      <w:pPr>
+        <w:jc w:val="both"/>
+        <w:rPr>
+          <w:sz w:val="20"/>
+          <w:szCs w:val="20"/>
+          <w:lang w:eastAsia="en-US"/>
+        </w:rPr>
+      </w:pPr>
+    </w:p>
+    <w:p>
+      <w:pPr>
+        <w:jc w:val="both"/>
+        <w:rPr>
+          <w:sz w:val="20"/>
+          <w:szCs w:val="20"/>
+          <w:lang w:eastAsia="en-US"/>
+        </w:rPr>
+      </w:pPr>
+    </w:p>
+    <w:p>
+      <w:pPr>
+        <w:jc w:val="both"/>
+        <w:rPr>
+          <w:sz w:val="20"/>
+          <w:szCs w:val="20"/>
+          <w:lang w:eastAsia="en-US"/>
+        </w:rPr>
+      </w:pPr>
+      <w:proofErr w:type="spellStart"/>
+      <w:r>
+        <w:rPr>
+          <w:sz w:val="20"/>
+          <w:szCs w:val="20"/>
+          <w:lang w:eastAsia="en-US"/>
+        </w:rPr>
         <w:t>Transmission</w:t>
       </w:r>
       <w:proofErr w:type="spellEnd"/>
@@ -3637,8 +3560,8 @@
       </w:r>
     </w:p>
     <w:sectPr>
-      <w:headerReference w:type="default" r:id="rId16"/>
-      <w:footerReference w:type="default" r:id="rId17"/>
+      <w:headerReference w:type="default" r:id="rId13"/>
+      <w:footerReference w:type="default" r:id="rId14"/>
       <w:pgSz w:w="12240" w:h="15840"/>
       <w:pgMar w:top="431" w:right="284" w:bottom="431" w:left="680" w:header="0" w:footer="340" w:gutter="0"/>
       <w:cols w:space="720"/>
@@ -5407,6 +5330,7 @@
   <w:style w:type="character" w:default="1" w:styleId="DefaultParagraphFont">
     <w:name w:val="Default Paragraph Font"/>
     <w:uiPriority w:val="1"/>
+    <w:semiHidden/>
     <w:unhideWhenUsed/>
   </w:style>
   <w:style w:type="table" w:default="1" w:styleId="TableNormal">

</xml_diff>